<commit_message>
Support two-column-spanning figures and page prefix in citations
- pandoc/latex.lua: figures inside ::: wide become figure* (from the copy
  in research-stable-matching)
- bunkajoho.cbx: add "p." to numeric postnotes, so that [p.123] gives
  "p.123" with both pandoc 3.1 (passes "p.123") and 3.7 (passes "123")
- Regenerate sample.tex/sample.pdf/sample.docx with pandoc 3.7

Co-Authored-By: Claude Opus 5.5 <noreply@anthropic.com>
</commit_message>
<xml_diff>
--- a/docx/sample.docx
+++ b/docx/sample.docx
@@ -7,6 +7,9 @@
         <w:pStyle w:val="PaperType"/>
       </w:pPr>
       <w:r>
+        <w:rPr>
+          <w:rFonts w:hint="eastAsia"/>
+        </w:rPr>
         <w:t xml:space="preserve">研究論文</w:t>
       </w:r>
     </w:p>
@@ -15,6 +18,9 @@
         <w:pStyle w:val="Title"/>
       </w:pPr>
       <w:r>
+        <w:rPr>
+          <w:rFonts w:hint="eastAsia"/>
+        </w:rPr>
         <w:t xml:space="preserve">紀要「文化情報学」テンプレートの設計</w:t>
       </w:r>
     </w:p>
@@ -23,6 +29,9 @@
         <w:pStyle w:val="Subtitle"/>
       </w:pPr>
       <w:r>
+        <w:rPr>
+          <w:rFonts w:hint="eastAsia"/>
+        </w:rPr>
         <w:t xml:space="preserve">―執筆要項に基づくクラスファイルと文献スタイル―</w:t>
       </w:r>
     </w:p>
@@ -31,7 +40,28 @@
         <w:pStyle w:val="Author"/>
       </w:pPr>
       <w:r>
-        <w:t xml:space="preserve">同志社 太郎・文化 花子</w:t>
+        <w:rPr>
+          <w:rFonts w:hint="eastAsia"/>
+        </w:rPr>
+        <w:t xml:space="preserve">同志社</w:t>
+      </w:r>
+      <w:r>
+        <w:t xml:space="preserve"> </w:t>
+      </w:r>
+      <w:r>
+        <w:rPr>
+          <w:rFonts w:hint="eastAsia"/>
+        </w:rPr>
+        <w:t xml:space="preserve">太郎・文化</w:t>
+      </w:r>
+      <w:r>
+        <w:t xml:space="preserve"> </w:t>
+      </w:r>
+      <w:r>
+        <w:rPr>
+          <w:rFonts w:hint="eastAsia"/>
+        </w:rPr>
+        <w:t xml:space="preserve">花子</w:t>
       </w:r>
     </w:p>
     <w:p>
@@ -39,7 +69,37 @@
         <w:pStyle w:val="Abstract"/>
       </w:pPr>
       <w:r>
-        <w:t xml:space="preserve">本稿は、同志社大学文化情報学会紀要『文化情報学』の執筆要項（2022 年 12 月 7 日改訂）に基づいて作成したテンプレートの使い方を示すものである。本文そのものが使用例となっており、タイトルページの構成、節番号、図表、数式、脚注、参照文献の書き方を順に説明する。要旨は和文・英文いずれで書いてもよい。</w:t>
+        <w:rPr>
+          <w:rFonts w:hint="eastAsia"/>
+        </w:rPr>
+        <w:t xml:space="preserve">本稿は、同志社大学文化情報学会紀要『文化情報学』の執筆要項（2022</w:t>
+      </w:r>
+      <w:r>
+        <w:t xml:space="preserve"> </w:t>
+      </w:r>
+      <w:r>
+        <w:rPr>
+          <w:rFonts w:hint="eastAsia"/>
+        </w:rPr>
+        <w:t xml:space="preserve">年</w:t>
+      </w:r>
+      <w:r>
+        <w:t xml:space="preserve"> 12 </w:t>
+      </w:r>
+      <w:r>
+        <w:rPr>
+          <w:rFonts w:hint="eastAsia"/>
+        </w:rPr>
+        <w:t xml:space="preserve">月</w:t>
+      </w:r>
+      <w:r>
+        <w:t xml:space="preserve"> 7 </w:t>
+      </w:r>
+      <w:r>
+        <w:rPr>
+          <w:rFonts w:hint="eastAsia"/>
+        </w:rPr>
+        <w:t xml:space="preserve">日改訂）に基づいて作成したテンプレートの使い方を示すものである。本文そのものが使用例となっており、タイトルページの構成、節番号、図表、数式、脚注、参照文献の書き方を順に説明する。要旨は和文・英文いずれで書いてもよい。</w:t>
       </w:r>
     </w:p>
     <w:p>
@@ -65,13 +125,49 @@
         <w:pStyle w:val="FirstParagraph"/>
       </w:pPr>
       <w:r>
-        <w:t xml:space="preserve">執筆要項では、掲載論文は LaTeX または Microsoft Word で作成し、編集委員会が用意したスタイルファイルを用いることとされている。本テンプレートはその叩き台であり、1 つの Markdown ファイル（sample.md）から</w:t>
-      </w:r>
-      <w:r>
-        <w:t xml:space="preserve"> </w:t>
-      </w:r>
-      <w:r>
-        <w:t xml:space="preserve">LaTeX 版（sample.tex）と Word 版（sample.docx）の両方を生成する。先頭のメタデータの</w:t>
+        <w:rPr>
+          <w:rFonts w:hint="eastAsia"/>
+        </w:rPr>
+        <w:t xml:space="preserve">執筆要項では、掲載論文は</w:t>
+      </w:r>
+      <w:r>
+        <w:t xml:space="preserve"> LaTeX または Microsoft Word </w:t>
+      </w:r>
+      <w:r>
+        <w:rPr>
+          <w:rFonts w:hint="eastAsia"/>
+        </w:rPr>
+        <w:t xml:space="preserve">で作成し、編集委員会が用意したスタイルファイルを用いることとされている。本テンプレートはその叩き台であり、1</w:t>
+      </w:r>
+      <w:r>
+        <w:t xml:space="preserve"> つの Markdown </w:t>
+      </w:r>
+      <w:r>
+        <w:rPr>
+          <w:rFonts w:hint="eastAsia"/>
+        </w:rPr>
+        <w:t xml:space="preserve">ファイル（sample.md）から</w:t>
+      </w:r>
+      <w:r>
+        <w:t xml:space="preserve"> </w:t>
+      </w:r>
+      <w:r>
+        <w:t xml:space="preserve">LaTeX </w:t>
+      </w:r>
+      <w:r>
+        <w:rPr>
+          <w:rFonts w:hint="eastAsia"/>
+        </w:rPr>
+        <w:t xml:space="preserve">版（sample.tex）と</w:t>
+      </w:r>
+      <w:r>
+        <w:t xml:space="preserve"> Word </w:t>
+      </w:r>
+      <w:r>
+        <w:rPr>
+          <w:rFonts w:hint="eastAsia"/>
+        </w:rPr>
+        <w:t xml:space="preserve">版（sample.docx）の両方を生成する。先頭のメタデータの</w:t>
       </w:r>
       <w:r>
         <w:t xml:space="preserve"> </w:t>
@@ -86,7 +182,19 @@
         <w:t xml:space="preserve"> </w:t>
       </w:r>
       <w:r>
-        <w:t xml:space="preserve">で種別（研究論文・研究ノート・資料紹介・書評）を切り替えると、第 1 ページ左上の種別ラベルが変わる。</w:t>
+        <w:rPr>
+          <w:rFonts w:hint="eastAsia"/>
+        </w:rPr>
+        <w:t xml:space="preserve">で種別（研究論文・研究ノート・資料紹介・書評）を切り替えると、第</w:t>
+      </w:r>
+      <w:r>
+        <w:t xml:space="preserve"> 1 </w:t>
+      </w:r>
+      <w:r>
+        <w:rPr>
+          <w:rFonts w:hint="eastAsia"/>
+        </w:rPr>
+        <w:t xml:space="preserve">ページ左上の種別ラベルが変わる。</w:t>
       </w:r>
     </w:p>
     <w:p>
@@ -94,7 +202,28 @@
         <w:pStyle w:val="BodyText"/>
       </w:pPr>
       <w:r>
-        <w:t xml:space="preserve">第 1 ページには、要項 4. のとおり、タイトル・種別・著者名・アブストラクトが置かれる。ページ番号は事務局が付けるため、投稿原稿には付けない。</w:t>
+        <w:rPr>
+          <w:rFonts w:hint="eastAsia"/>
+        </w:rPr>
+        <w:t xml:space="preserve">第</w:t>
+      </w:r>
+      <w:r>
+        <w:t xml:space="preserve"> 1 </w:t>
+      </w:r>
+      <w:r>
+        <w:rPr>
+          <w:rFonts w:hint="eastAsia"/>
+        </w:rPr>
+        <w:t xml:space="preserve">ページには、要項</w:t>
+      </w:r>
+      <w:r>
+        <w:t xml:space="preserve"> 4. </w:t>
+      </w:r>
+      <w:r>
+        <w:rPr>
+          <w:rFonts w:hint="eastAsia"/>
+        </w:rPr>
+        <w:t xml:space="preserve">のとおり、タイトル・種別・著者名・アブストラクトが置かれる。ページ番号は事務局が付けるため、投稿原稿には付けない。</w:t>
       </w:r>
     </w:p>
     <w:p>
@@ -102,7 +231,13 @@
         <w:pStyle w:val="Heading1"/>
       </w:pPr>
       <w:r>
-        <w:t xml:space="preserve">2. 本文の書き方</w:t>
+        <w:t xml:space="preserve">2. </w:t>
+      </w:r>
+      <w:r>
+        <w:rPr>
+          <w:rFonts w:hint="eastAsia"/>
+        </w:rPr>
+        <w:t xml:space="preserve">本文の書き方</w:t>
       </w:r>
     </w:p>
     <w:p>
@@ -110,7 +245,13 @@
         <w:pStyle w:val="Heading2"/>
       </w:pPr>
       <w:r>
-        <w:t xml:space="preserve">2.1 節と項</w:t>
+        <w:t xml:space="preserve">2.1 </w:t>
+      </w:r>
+      <w:r>
+        <w:rPr>
+          <w:rFonts w:hint="eastAsia"/>
+        </w:rPr>
+        <w:t xml:space="preserve">節と項</w:t>
       </w:r>
     </w:p>
     <w:p>
@@ -118,7 +259,28 @@
         <w:pStyle w:val="FirstParagraph"/>
       </w:pPr>
       <w:r>
-        <w:t xml:space="preserve">本文は節から構成し、各節には 1、2.3、3.4.2 のように番号を付ける（要項 5.）。</w:t>
+        <w:rPr>
+          <w:rFonts w:hint="eastAsia"/>
+        </w:rPr>
+        <w:t xml:space="preserve">本文は節から構成し、各節には</w:t>
+      </w:r>
+      <w:r>
+        <w:t xml:space="preserve"> 1、2.3、3.4.2 </w:t>
+      </w:r>
+      <w:r>
+        <w:rPr>
+          <w:rFonts w:hint="eastAsia"/>
+        </w:rPr>
+        <w:t xml:space="preserve">のように番号を付ける（要項</w:t>
+      </w:r>
+      <w:r>
+        <w:t xml:space="preserve"> </w:t>
+      </w:r>
+      <w:r>
+        <w:rPr>
+          <w:rFonts w:hint="eastAsia"/>
+        </w:rPr>
+        <w:t xml:space="preserve">5.）。</w:t>
       </w:r>
       <w:r>
         <w:t xml:space="preserve"> </w:t>
@@ -157,6 +319,9 @@
         <w:t xml:space="preserve"> </w:t>
       </w:r>
       <w:r>
+        <w:rPr>
+          <w:rFonts w:hint="eastAsia"/>
+        </w:rPr>
         <w:t xml:space="preserve">の見出しがそれぞれに対応し、番号は自動で付く。</w:t>
       </w:r>
     </w:p>
@@ -165,7 +330,13 @@
         <w:pStyle w:val="Heading3"/>
       </w:pPr>
       <w:r>
-        <w:t xml:space="preserve">2.1.1 表記上の注意</w:t>
+        <w:t xml:space="preserve">2.1.1 </w:t>
+      </w:r>
+      <w:r>
+        <w:rPr>
+          <w:rFonts w:hint="eastAsia"/>
+        </w:rPr>
+        <w:t xml:space="preserve">表記上の注意</w:t>
       </w:r>
     </w:p>
     <w:p>
@@ -173,7 +344,19 @@
         <w:pStyle w:val="FirstParagraph"/>
       </w:pPr>
       <w:r>
-        <w:t xml:space="preserve">日本語で執筆する場合、句読点は「、」と「。」を用いる。専門用語は原則として日本語で表記し、必要なら初出時のみ欧文を丸括弧内に併記する。たとえば「アフォーダンス（affordance）」のように書く。略語は初出時に正式名を記し、続けて丸括弧内に略語を示す。たとえば「大規模言語モデル（Large Language Model; LLM）」とする。</w:t>
+        <w:rPr>
+          <w:rFonts w:hint="eastAsia"/>
+        </w:rPr>
+        <w:t xml:space="preserve">日本語で執筆する場合、句読点は「、」と「。」を用いる。専門用語は原則として日本語で表記し、必要なら初出時のみ欧文を丸括弧内に併記する。たとえば「アフォーダンス（affordance）」のように書く。略語は初出時に正式名を記し、続けて丸括弧内に略語を示す。たとえば「大規模言語モデル（Large</w:t>
+      </w:r>
+      <w:r>
+        <w:t xml:space="preserve"> Language Model; </w:t>
+      </w:r>
+      <w:r>
+        <w:rPr>
+          <w:rFonts w:hint="eastAsia"/>
+        </w:rPr>
+        <w:t xml:space="preserve">LLM）」とする。</w:t>
       </w:r>
     </w:p>
     <w:p>
@@ -181,7 +364,13 @@
         <w:pStyle w:val="Heading2"/>
       </w:pPr>
       <w:r>
-        <w:t xml:space="preserve">2.2 数式</w:t>
+        <w:t xml:space="preserve">2.2 </w:t>
+      </w:r>
+      <w:r>
+        <w:rPr>
+          <w:rFonts w:hint="eastAsia"/>
+        </w:rPr>
+        <w:t xml:space="preserve">数式</w:t>
       </w:r>
     </w:p>
     <w:p>
@@ -189,6 +378,9 @@
         <w:pStyle w:val="FirstParagraph"/>
       </w:pPr>
       <w:r>
+        <w:rPr>
+          <w:rFonts w:hint="eastAsia"/>
+        </w:rPr>
         <w:t xml:space="preserve">数式は別行に記し、末尾に通し番号を付ける。</w:t>
       </w:r>
     </w:p>
@@ -203,19 +395,21 @@
         <m:r>
           <m:t>H</m:t>
         </m:r>
-        <m:d>
-          <m:dPr>
-            <m:begChr m:val="("/>
-            <m:endChr m:val=")"/>
-            <m:sepChr m:val=""/>
-            <m:grow/>
-          </m:dPr>
-          <m:e>
-            <m:r>
-              <m:t>X</m:t>
-            </m:r>
-          </m:e>
-        </m:d>
+        <m:r>
+          <m:rPr>
+            <m:sty m:val="p"/>
+          </m:rPr>
+          <m:t>(</m:t>
+        </m:r>
+        <m:r>
+          <m:t>X</m:t>
+        </m:r>
+        <m:r>
+          <m:rPr>
+            <m:sty m:val="p"/>
+          </m:rPr>
+          <m:t>)</m:t>
+        </m:r>
         <m:r>
           <m:rPr>
             <m:sty m:val="p"/>
@@ -260,28 +454,30 @@
             </m:r>
           </m:e>
         </m:nary>
-        <m:d>
-          <m:dPr>
-            <m:begChr m:val="("/>
-            <m:endChr m:val=")"/>
-            <m:sepChr m:val=""/>
-            <m:grow/>
-          </m:dPr>
+        <m:r>
+          <m:rPr>
+            <m:sty m:val="p"/>
+          </m:rPr>
+          <m:t>(</m:t>
+        </m:r>
+        <m:sSub>
           <m:e>
-            <m:sSub>
-              <m:e>
-                <m:r>
-                  <m:t>x</m:t>
-                </m:r>
-              </m:e>
-              <m:sub>
-                <m:r>
-                  <m:t>i</m:t>
-                </m:r>
-              </m:sub>
-            </m:sSub>
+            <m:r>
+              <m:t>x</m:t>
+            </m:r>
           </m:e>
-        </m:d>
+          <m:sub>
+            <m:r>
+              <m:t>i</m:t>
+            </m:r>
+          </m:sub>
+        </m:sSub>
+        <m:r>
+          <m:rPr>
+            <m:sty m:val="p"/>
+          </m:rPr>
+          <m:t>)</m:t>
+        </m:r>
         <m:sSub>
           <m:e>
             <m:r>
@@ -300,28 +496,30 @@
         <m:r>
           <m:t>p</m:t>
         </m:r>
-        <m:d>
-          <m:dPr>
-            <m:begChr m:val="("/>
-            <m:endChr m:val=")"/>
-            <m:sepChr m:val=""/>
-            <m:grow/>
-          </m:dPr>
+        <m:r>
+          <m:rPr>
+            <m:sty m:val="p"/>
+          </m:rPr>
+          <m:t>(</m:t>
+        </m:r>
+        <m:sSub>
           <m:e>
-            <m:sSub>
-              <m:e>
-                <m:r>
-                  <m:t>x</m:t>
-                </m:r>
-              </m:e>
-              <m:sub>
-                <m:r>
-                  <m:t>i</m:t>
-                </m:r>
-              </m:sub>
-            </m:sSub>
+            <m:r>
+              <m:t>x</m:t>
+            </m:r>
           </m:e>
-        </m:d>
+          <m:sub>
+            <m:r>
+              <m:t>i</m:t>
+            </m:r>
+          </m:sub>
+        </m:sSub>
+        <m:r>
+          <m:rPr>
+            <m:sty m:val="p"/>
+          </m:rPr>
+          <m:t>)</m:t>
+        </m:r>
       </m:oMath>
       <w:r>
         <w:tab/>
@@ -335,6 +533,9 @@
         <w:pStyle w:val="BodyTextContinued"/>
       </w:pPr>
       <w:r>
+        <w:rPr>
+          <w:rFonts w:hint="eastAsia"/>
+        </w:rPr>
         <w:t xml:space="preserve">本文中に埋め込む場合には、</w:t>
       </w:r>
       <m:oMath>
@@ -361,35 +562,11 @@
           </m:rPr>
           <m:t>exp</m:t>
         </m:r>
-        <m:d>
-          <m:dPr>
-            <m:begChr m:val="("/>
-            <m:endChr m:val=")"/>
-            <m:sepChr m:val=""/>
-            <m:grow/>
-          </m:dPr>
-          <m:e>
-            <m:r>
-              <m:t>x</m:t>
-            </m:r>
-            <m:r>
-              <m:rPr>
-                <m:sty m:val="p"/>
-              </m:rPr>
-              <m:t>/</m:t>
-            </m:r>
-            <m:r>
-              <m:t>y</m:t>
-            </m:r>
-          </m:e>
-        </m:d>
-      </m:oMath>
-      <w:r>
-        <w:t xml:space="preserve">、</w:t>
-      </w:r>
-      <m:oMath>
-        <m:r>
-          <m:t>δ</m:t>
+        <m:r>
+          <m:rPr>
+            <m:sty m:val="p"/>
+          </m:rPr>
+          <m:t>(</m:t>
         </m:r>
         <m:r>
           <m:t>x</m:t>
@@ -401,9 +578,35 @@
           <m:t>/</m:t>
         </m:r>
         <m:r>
+          <m:t>y</m:t>
+        </m:r>
+        <m:r>
+          <m:rPr>
+            <m:sty m:val="p"/>
+          </m:rPr>
+          <m:t>)</m:t>
+        </m:r>
+      </m:oMath>
+      <w:r>
+        <w:t xml:space="preserve">、</w:t>
+      </w:r>
+      <m:oMath>
+        <m:r>
           <m:t>δ</m:t>
         </m:r>
         <m:r>
+          <m:t>x</m:t>
+        </m:r>
+        <m:r>
+          <m:rPr>
+            <m:sty m:val="p"/>
+          </m:rPr>
+          <m:t>/</m:t>
+        </m:r>
+        <m:r>
+          <m:t>δ</m:t>
+        </m:r>
+        <m:r>
           <m:t>t</m:t>
         </m:r>
       </m:oMath>
@@ -411,7 +614,19 @@
         <w:t xml:space="preserve"> </w:t>
       </w:r>
       <w:r>
-        <w:t xml:space="preserve">のような記法を用いる。式番号は式 (2) のように参照する。</w:t>
+        <w:rPr>
+          <w:rFonts w:hint="eastAsia"/>
+        </w:rPr>
+        <w:t xml:space="preserve">のような記法を用いる。式番号は式</w:t>
+      </w:r>
+      <w:r>
+        <w:t xml:space="preserve"> (2) </w:t>
+      </w:r>
+      <w:r>
+        <w:rPr>
+          <w:rFonts w:hint="eastAsia"/>
+        </w:rPr>
+        <w:t xml:space="preserve">のように参照する。</w:t>
       </w:r>
     </w:p>
     <w:p>
@@ -425,28 +640,30 @@
         <m:r>
           <m:t>I</m:t>
         </m:r>
-        <m:d>
-          <m:dPr>
-            <m:begChr m:val="("/>
-            <m:endChr m:val=")"/>
-            <m:sepChr m:val=""/>
-            <m:grow/>
-          </m:dPr>
-          <m:e>
-            <m:r>
-              <m:t>X</m:t>
-            </m:r>
-            <m:r>
-              <m:rPr>
-                <m:sty m:val="p"/>
-              </m:rPr>
-              <m:t>;</m:t>
-            </m:r>
-            <m:r>
-              <m:t>Y</m:t>
-            </m:r>
-          </m:e>
-        </m:d>
+        <m:r>
+          <m:rPr>
+            <m:sty m:val="p"/>
+          </m:rPr>
+          <m:t>(</m:t>
+        </m:r>
+        <m:r>
+          <m:t>X</m:t>
+        </m:r>
+        <m:r>
+          <m:rPr>
+            <m:sty m:val="p"/>
+          </m:rPr>
+          <m:t>;</m:t>
+        </m:r>
+        <m:r>
+          <m:t>Y</m:t>
+        </m:r>
+        <m:r>
+          <m:rPr>
+            <m:sty m:val="p"/>
+          </m:rPr>
+          <m:t>)</m:t>
+        </m:r>
         <m:r>
           <m:rPr>
             <m:sty m:val="p"/>
@@ -456,19 +673,21 @@
         <m:r>
           <m:t>H</m:t>
         </m:r>
-        <m:d>
-          <m:dPr>
-            <m:begChr m:val="("/>
-            <m:endChr m:val=")"/>
-            <m:sepChr m:val=""/>
-            <m:grow/>
-          </m:dPr>
-          <m:e>
-            <m:r>
-              <m:t>X</m:t>
-            </m:r>
-          </m:e>
-        </m:d>
+        <m:r>
+          <m:rPr>
+            <m:sty m:val="p"/>
+          </m:rPr>
+          <m:t>(</m:t>
+        </m:r>
+        <m:r>
+          <m:t>X</m:t>
+        </m:r>
+        <m:r>
+          <m:rPr>
+            <m:sty m:val="p"/>
+          </m:rPr>
+          <m:t>)</m:t>
+        </m:r>
         <m:r>
           <m:rPr>
             <m:sty m:val="p"/>
@@ -478,28 +697,30 @@
         <m:r>
           <m:t>H</m:t>
         </m:r>
-        <m:d>
-          <m:dPr>
-            <m:begChr m:val="("/>
-            <m:endChr m:val=")"/>
-            <m:sepChr m:val=""/>
-            <m:grow/>
-          </m:dPr>
-          <m:e>
-            <m:r>
-              <m:t>X</m:t>
-            </m:r>
-            <m:r>
-              <m:rPr>
-                <m:sty m:val="p"/>
-              </m:rPr>
-              <m:t>∣</m:t>
-            </m:r>
-            <m:r>
-              <m:t>Y</m:t>
-            </m:r>
-          </m:e>
-        </m:d>
+        <m:r>
+          <m:rPr>
+            <m:sty m:val="p"/>
+          </m:rPr>
+          <m:t>(</m:t>
+        </m:r>
+        <m:r>
+          <m:t>X</m:t>
+        </m:r>
+        <m:r>
+          <m:rPr>
+            <m:sty m:val="p"/>
+          </m:rPr>
+          <m:t>∣</m:t>
+        </m:r>
+        <m:r>
+          <m:t>Y</m:t>
+        </m:r>
+        <m:r>
+          <m:rPr>
+            <m:sty m:val="p"/>
+          </m:rPr>
+          <m:t>)</m:t>
+        </m:r>
       </m:oMath>
       <w:r>
         <w:tab/>
@@ -513,7 +734,13 @@
         <w:pStyle w:val="Heading2"/>
       </w:pPr>
       <w:r>
-        <w:t xml:space="preserve">2.3 注</w:t>
+        <w:t xml:space="preserve">2.3 </w:t>
+      </w:r>
+      <w:r>
+        <w:rPr>
+          <w:rFonts w:hint="eastAsia"/>
+        </w:rPr>
+        <w:t xml:space="preserve">注</w:t>
       </w:r>
     </w:p>
     <w:p>
@@ -521,13 +748,16 @@
         <w:pStyle w:val="FirstParagraph"/>
       </w:pPr>
       <w:r>
+        <w:rPr>
+          <w:rFonts w:hint="eastAsia"/>
+        </w:rPr>
         <w:t xml:space="preserve">注はなるべく用いない</w:t>
       </w:r>
       <w:r>
         <w:rPr>
           <w:rStyle w:val="FootnoteReference"/>
         </w:rPr>
-        <w:footnoteReference w:id="20"/>
+        <w:footnoteReference w:id="18"/>
       </w:r>
       <w:r>
         <w:t xml:space="preserve">。</w:t>
@@ -538,7 +768,13 @@
         <w:pStyle w:val="Heading1"/>
       </w:pPr>
       <w:r>
-        <w:t xml:space="preserve">3. 図表</w:t>
+        <w:t xml:space="preserve">3. </w:t>
+      </w:r>
+      <w:r>
+        <w:rPr>
+          <w:rFonts w:hint="eastAsia"/>
+        </w:rPr>
+        <w:t xml:space="preserve">図表</w:t>
       </w:r>
     </w:p>
     <w:p>
@@ -546,7 +782,64 @@
         <w:pStyle w:val="FirstParagraph"/>
       </w:pPr>
       <w:r>
-        <w:t xml:space="preserve">図表には「図 1」「表 1」のように通し番号を付け、キャプションは原則として日本語で書く（要項 6.）。図 1 と表 1 に例を示す。査読用原稿では図表を本文中に埋め込んで提出し、採択後の最終原稿では図の相当部分を空白にして充分な解像度のデータを別途提出する（要項 4.）。他の文献から転載する場合は、著作権者の了解を得たうえで出典を明記する。</w:t>
+        <w:rPr>
+          <w:rFonts w:hint="eastAsia"/>
+        </w:rPr>
+        <w:t xml:space="preserve">図表には「図</w:t>
+      </w:r>
+      <w:r>
+        <w:t xml:space="preserve"> </w:t>
+      </w:r>
+      <w:r>
+        <w:rPr>
+          <w:rFonts w:hint="eastAsia"/>
+        </w:rPr>
+        <w:t xml:space="preserve">1」「表</w:t>
+      </w:r>
+      <w:r>
+        <w:t xml:space="preserve"> </w:t>
+      </w:r>
+      <w:r>
+        <w:rPr>
+          <w:rFonts w:hint="eastAsia"/>
+        </w:rPr>
+        <w:t xml:space="preserve">1」のように通し番号を付け、キャプションは原則として日本語で書く（要項</w:t>
+      </w:r>
+      <w:r>
+        <w:t xml:space="preserve"> </w:t>
+      </w:r>
+      <w:r>
+        <w:rPr>
+          <w:rFonts w:hint="eastAsia"/>
+        </w:rPr>
+        <w:t xml:space="preserve">6.）。図</w:t>
+      </w:r>
+      <w:r>
+        <w:t xml:space="preserve"> 1 </w:t>
+      </w:r>
+      <w:r>
+        <w:rPr>
+          <w:rFonts w:hint="eastAsia"/>
+        </w:rPr>
+        <w:t xml:space="preserve">と表</w:t>
+      </w:r>
+      <w:r>
+        <w:t xml:space="preserve"> 1 </w:t>
+      </w:r>
+      <w:r>
+        <w:rPr>
+          <w:rFonts w:hint="eastAsia"/>
+        </w:rPr>
+        <w:t xml:space="preserve">に例を示す。査読用原稿では図表を本文中に埋め込んで提出し、採択後の最終原稿では図の相当部分を空白にして充分な解像度のデータを別途提出する（要項</w:t>
+      </w:r>
+      <w:r>
+        <w:t xml:space="preserve"> </w:t>
+      </w:r>
+      <w:r>
+        <w:rPr>
+          <w:rFonts w:hint="eastAsia"/>
+        </w:rPr>
+        <w:t xml:space="preserve">4.）。他の文献から転載する場合は、著作権者の了解を得たうえで出典を明記する。</w:t>
       </w:r>
     </w:p>
     <w:p>
@@ -558,18 +851,18 @@
           <wp:inline>
             <wp:extent cx="2752374" cy="1039785"/>
             <wp:effectExtent b="0" l="0" r="0" t="0"/>
-            <wp:docPr descr="図の例" title="" id="22" name="Picture"/>
+            <wp:docPr descr="図の例" title="" id="20" name="Picture"/>
             <a:graphic>
               <a:graphicData uri="http://schemas.openxmlformats.org/drawingml/2006/picture">
                 <pic:pic>
                   <pic:nvPicPr>
-                    <pic:cNvPr descr="figure1.png" id="23" name="Picture"/>
+                    <pic:cNvPr descr="figure1.png" id="21" name="Picture"/>
                     <pic:cNvPicPr>
                       <a:picLocks noChangeArrowheads="1" noChangeAspect="1"/>
                     </pic:cNvPicPr>
                   </pic:nvPicPr>
                   <pic:blipFill>
-                    <a:blip r:embed="rId21"/>
+                    <a:blip r:embed="rId19"/>
                     <a:stretch>
                       <a:fillRect/>
                     </a:stretch>
@@ -601,7 +894,19 @@
         <w:pStyle w:val="ImageCaption"/>
       </w:pPr>
       <w:r>
-        <w:t xml:space="preserve">図 1　図の例</w:t>
+        <w:rPr>
+          <w:rFonts w:hint="eastAsia"/>
+        </w:rPr>
+        <w:t xml:space="preserve">図</w:t>
+      </w:r>
+      <w:r>
+        <w:t xml:space="preserve"> 1　</w:t>
+      </w:r>
+      <w:r>
+        <w:rPr>
+          <w:rFonts w:hint="eastAsia"/>
+        </w:rPr>
+        <w:t xml:space="preserve">図の例</w:t>
       </w:r>
     </w:p>
     <w:p>
@@ -609,7 +914,19 @@
         <w:pStyle w:val="TableCaption"/>
       </w:pPr>
       <w:r>
-        <w:t xml:space="preserve">表 1　表の例</w:t>
+        <w:rPr>
+          <w:rFonts w:hint="eastAsia"/>
+        </w:rPr>
+        <w:t xml:space="preserve">表</w:t>
+      </w:r>
+      <w:r>
+        <w:t xml:space="preserve"> 1　</w:t>
+      </w:r>
+      <w:r>
+        <w:rPr>
+          <w:rFonts w:hint="eastAsia"/>
+        </w:rPr>
+        <w:t xml:space="preserve">表の例</w:t>
       </w:r>
     </w:p>
     <w:tbl>
@@ -617,7 +934,6 @@
         <w:tblStyle w:val="Table"/>
         <w:tblW w:type="auto" w:w="0"/>
         <w:tblLook w:firstRow="1" w:lastRow="0" w:firstColumn="0" w:lastColumn="0" w:noHBand="0" w:noVBand="0" w:val="0020"/>
-        <w:jc w:val="start"/>
         <w:tblCaption w:val="表 1　表の例"/>
       </w:tblPr>
       <w:tblGrid>
@@ -627,7 +943,7 @@
       </w:tblGrid>
       <w:tr>
         <w:trPr>
-          <w:tblHeader w:val="true"/>
+          <w:tblHeader w:val="on"/>
         </w:trPr>
         <w:tc>
           <w:tcPr/>
@@ -637,6 +953,9 @@
               <w:jc w:val="left"/>
             </w:pPr>
             <w:r>
+              <w:rPr>
+                <w:rFonts w:hint="eastAsia"/>
+              </w:rPr>
               <w:t xml:space="preserve">項目</w:t>
             </w:r>
           </w:p>
@@ -649,6 +968,9 @@
               <w:jc w:val="right"/>
             </w:pPr>
             <w:r>
+              <w:rPr>
+                <w:rFonts w:hint="eastAsia"/>
+              </w:rPr>
               <w:t xml:space="preserve">度数</w:t>
             </w:r>
           </w:p>
@@ -661,6 +983,9 @@
               <w:jc w:val="right"/>
             </w:pPr>
             <w:r>
+              <w:rPr>
+                <w:rFonts w:hint="eastAsia"/>
+              </w:rPr>
               <w:t xml:space="preserve">割合（%）</w:t>
             </w:r>
           </w:p>
@@ -675,6 +1000,9 @@
               <w:jc w:val="left"/>
             </w:pPr>
             <w:r>
+              <w:rPr>
+                <w:rFonts w:hint="eastAsia"/>
+              </w:rPr>
               <w:t xml:space="preserve">研究論文</w:t>
             </w:r>
           </w:p>
@@ -713,6 +1041,9 @@
               <w:jc w:val="left"/>
             </w:pPr>
             <w:r>
+              <w:rPr>
+                <w:rFonts w:hint="eastAsia"/>
+              </w:rPr>
               <w:t xml:space="preserve">研究ノート</w:t>
             </w:r>
           </w:p>
@@ -751,6 +1082,9 @@
               <w:jc w:val="left"/>
             </w:pPr>
             <w:r>
+              <w:rPr>
+                <w:rFonts w:hint="eastAsia"/>
+              </w:rPr>
               <w:t xml:space="preserve">書評</w:t>
             </w:r>
           </w:p>
@@ -786,7 +1120,13 @@
         <w:pStyle w:val="Heading1"/>
       </w:pPr>
       <w:r>
-        <w:t xml:space="preserve">4. 参照文献</w:t>
+        <w:t xml:space="preserve">4. </w:t>
+      </w:r>
+      <w:r>
+        <w:rPr>
+          <w:rFonts w:hint="eastAsia"/>
+        </w:rPr>
+        <w:t xml:space="preserve">参照文献</w:t>
       </w:r>
     </w:p>
     <w:p>
@@ -794,7 +1134,37 @@
         <w:pStyle w:val="FirstParagraph"/>
       </w:pPr>
       <w:r>
-        <w:t xml:space="preserve">本文中で文献を参照する際は、著者の姓の後に発表年を西暦で記す（要項 7.）。表 2 に要項の例と対応する Markdown の書き方を示す。</w:t>
+        <w:rPr>
+          <w:rFonts w:hint="eastAsia"/>
+        </w:rPr>
+        <w:t xml:space="preserve">本文中で文献を参照する際は、著者の姓の後に発表年を西暦で記す（要項</w:t>
+      </w:r>
+      <w:r>
+        <w:t xml:space="preserve"> </w:t>
+      </w:r>
+      <w:r>
+        <w:rPr>
+          <w:rFonts w:hint="eastAsia"/>
+        </w:rPr>
+        <w:t xml:space="preserve">7.）。表</w:t>
+      </w:r>
+      <w:r>
+        <w:t xml:space="preserve"> 2 </w:t>
+      </w:r>
+      <w:r>
+        <w:rPr>
+          <w:rFonts w:hint="eastAsia"/>
+        </w:rPr>
+        <w:t xml:space="preserve">に要項の例と対応する</w:t>
+      </w:r>
+      <w:r>
+        <w:t xml:space="preserve"> Markdown </w:t>
+      </w:r>
+      <w:r>
+        <w:rPr>
+          <w:rFonts w:hint="eastAsia"/>
+        </w:rPr>
+        <w:t xml:space="preserve">の書き方を示す。</w:t>
       </w:r>
     </w:p>
     <w:p>
@@ -802,15 +1172,27 @@
         <w:pStyle w:val="TableCaption"/>
       </w:pPr>
       <w:r>
-        <w:t xml:space="preserve">表 2　引用の書き方と出力</w:t>
+        <w:rPr>
+          <w:rFonts w:hint="eastAsia"/>
+        </w:rPr>
+        <w:t xml:space="preserve">表</w:t>
+      </w:r>
+      <w:r>
+        <w:t xml:space="preserve"> 2　</w:t>
+      </w:r>
+      <w:r>
+        <w:rPr>
+          <w:rFonts w:hint="eastAsia"/>
+        </w:rPr>
+        <w:t xml:space="preserve">引用の書き方と出力</w:t>
       </w:r>
     </w:p>
     <w:tbl>
       <w:tblPr>
         <w:tblStyle w:val="Table"/>
         <w:tblW w:type="pct" w:w="5000"/>
+        <w:tblLayout w:type="fixed"/>
         <w:tblLook w:firstRow="1" w:lastRow="0" w:firstColumn="0" w:lastColumn="0" w:noHBand="0" w:noVBand="0" w:val="0020"/>
-        <w:jc w:val="start"/>
         <w:tblCaption w:val="表 2　引用の書き方と出力"/>
       </w:tblPr>
       <w:tblGrid>
@@ -819,7 +1201,7 @@
       </w:tblGrid>
       <w:tr>
         <w:trPr>
-          <w:tblHeader w:val="true"/>
+          <w:tblHeader w:val="on"/>
         </w:trPr>
         <w:tc>
           <w:tcPr/>
@@ -841,6 +1223,9 @@
               <w:jc w:val="left"/>
             </w:pPr>
             <w:r>
+              <w:rPr>
+                <w:rFonts w:hint="eastAsia"/>
+              </w:rPr>
               <w:t xml:space="preserve">出力</w:t>
             </w:r>
           </w:p>
@@ -870,7 +1255,13 @@
               <w:jc w:val="left"/>
             </w:pPr>
             <w:r>
-              <w:t xml:space="preserve">Gibson （1979）</w:t>
+              <w:t xml:space="preserve">Gibson </w:t>
+            </w:r>
+            <w:r>
+              <w:rPr>
+                <w:rFonts w:hint="eastAsia"/>
+              </w:rPr>
+              <w:t xml:space="preserve">（1979）</w:t>
             </w:r>
           </w:p>
         </w:tc>
@@ -899,7 +1290,19 @@
               <w:jc w:val="left"/>
             </w:pPr>
             <w:r>
-              <w:t xml:space="preserve">（佐伯・佐々木, 1990）</w:t>
+              <w:rPr>
+                <w:rFonts w:hint="eastAsia"/>
+              </w:rPr>
+              <w:t xml:space="preserve">（佐伯・佐々木,</w:t>
+            </w:r>
+            <w:r>
+              <w:t xml:space="preserve"> </w:t>
+            </w:r>
+            <w:r>
+              <w:rPr>
+                <w:rFonts w:hint="eastAsia"/>
+              </w:rPr>
+              <w:t xml:space="preserve">1990）</w:t>
             </w:r>
           </w:p>
         </w:tc>
@@ -928,7 +1331,22 @@
               <w:jc w:val="left"/>
             </w:pPr>
             <w:r>
-              <w:t xml:space="preserve">Haugeland （1987, p.123）</w:t>
+              <w:t xml:space="preserve">Haugeland </w:t>
+            </w:r>
+            <w:r>
+              <w:rPr>
+                <w:rFonts w:hint="eastAsia"/>
+              </w:rPr>
+              <w:t xml:space="preserve">（1987,</w:t>
+            </w:r>
+            <w:r>
+              <w:t xml:space="preserve"> </w:t>
+            </w:r>
+            <w:r>
+              <w:rPr>
+                <w:rFonts w:hint="eastAsia"/>
+              </w:rPr>
+              <w:t xml:space="preserve">p.123）</w:t>
             </w:r>
           </w:p>
         </w:tc>
@@ -963,7 +1381,19 @@
               <w:t xml:space="preserve"> </w:t>
             </w:r>
             <w:r>
-              <w:t xml:space="preserve">（1973, 1981）</w:t>
+              <w:rPr>
+                <w:rFonts w:hint="eastAsia"/>
+              </w:rPr>
+              <w:t xml:space="preserve">（1973,</w:t>
+            </w:r>
+            <w:r>
+              <w:t xml:space="preserve"> </w:t>
+            </w:r>
+            <w:r>
+              <w:rPr>
+                <w:rFonts w:hint="eastAsia"/>
+              </w:rPr>
+              <w:t xml:space="preserve">1981）</w:t>
             </w:r>
           </w:p>
         </w:tc>
@@ -992,7 +1422,19 @@
               <w:jc w:val="left"/>
             </w:pPr>
             <w:r>
-              <w:t xml:space="preserve">（Simon, 1973, 1981）</w:t>
+              <w:rPr>
+                <w:rFonts w:hint="eastAsia"/>
+              </w:rPr>
+              <w:t xml:space="preserve">（Simon,</w:t>
+            </w:r>
+            <w:r>
+              <w:t xml:space="preserve"> 1973, </w:t>
+            </w:r>
+            <w:r>
+              <w:rPr>
+                <w:rFonts w:hint="eastAsia"/>
+              </w:rPr>
+              <w:t xml:space="preserve">1981）</w:t>
             </w:r>
           </w:p>
         </w:tc>
@@ -1021,7 +1463,13 @@
               <w:jc w:val="left"/>
             </w:pPr>
             <w:r>
-              <w:t xml:space="preserve">Cohen &amp; Levesque （1990a）</w:t>
+              <w:t xml:space="preserve">Cohen &amp; Levesque </w:t>
+            </w:r>
+            <w:r>
+              <w:rPr>
+                <w:rFonts w:hint="eastAsia"/>
+              </w:rPr>
+              <w:t xml:space="preserve">（1990a）</w:t>
             </w:r>
           </w:p>
         </w:tc>
@@ -1050,7 +1498,19 @@
               <w:jc w:val="left"/>
             </w:pPr>
             <w:r>
-              <w:t xml:space="preserve">（Cohen &amp; Levesque, 1990a, 1990b）</w:t>
+              <w:rPr>
+                <w:rFonts w:hint="eastAsia"/>
+              </w:rPr>
+              <w:t xml:space="preserve">（Cohen</w:t>
+            </w:r>
+            <w:r>
+              <w:t xml:space="preserve"> &amp; Levesque, 1990a, </w:t>
+            </w:r>
+            <w:r>
+              <w:rPr>
+                <w:rFonts w:hint="eastAsia"/>
+              </w:rPr>
+              <w:t xml:space="preserve">1990b）</w:t>
             </w:r>
           </w:p>
         </w:tc>
@@ -1079,7 +1539,28 @@
               <w:jc w:val="left"/>
             </w:pPr>
             <w:r>
-              <w:t xml:space="preserve">（安西 他, 1992; Joshi et al., 1981; Minsky, 1975, 1986a）</w:t>
+              <w:rPr>
+                <w:rFonts w:hint="eastAsia"/>
+              </w:rPr>
+              <w:t xml:space="preserve">（安西</w:t>
+            </w:r>
+            <w:r>
+              <w:t xml:space="preserve"> </w:t>
+            </w:r>
+            <w:r>
+              <w:rPr>
+                <w:rFonts w:hint="eastAsia"/>
+              </w:rPr>
+              <w:t xml:space="preserve">他,</w:t>
+            </w:r>
+            <w:r>
+              <w:t xml:space="preserve"> 1992; Joshi et al., 1981; Minsky, 1975, </w:t>
+            </w:r>
+            <w:r>
+              <w:rPr>
+                <w:rFonts w:hint="eastAsia"/>
+              </w:rPr>
+              <w:t xml:space="preserve">1986a）</w:t>
             </w:r>
           </w:p>
         </w:tc>
@@ -1090,24 +1571,51 @@
         <w:pStyle w:val="BodyText"/>
       </w:pPr>
       <w:r>
+        <w:rPr>
+          <w:rFonts w:hint="eastAsia"/>
+        </w:rPr>
         <w:t xml:space="preserve">文章の一部として読む場合は</w:t>
       </w:r>
       <w:r>
         <w:t xml:space="preserve"> </w:t>
       </w:r>
       <w:r>
-        <w:t xml:space="preserve">Gibson （1979）</w:t>
-      </w:r>
-      <w:r>
-        <w:t xml:space="preserve"> </w:t>
-      </w:r>
-      <w:r>
+        <w:t xml:space="preserve">Gibson </w:t>
+      </w:r>
+      <w:r>
+        <w:rPr>
+          <w:rFonts w:hint="eastAsia"/>
+        </w:rPr>
+        <w:t xml:space="preserve">（1979）</w:t>
+      </w:r>
+      <w:r>
+        <w:t xml:space="preserve"> </w:t>
+      </w:r>
+      <w:r>
+        <w:rPr>
+          <w:rFonts w:hint="eastAsia"/>
+        </w:rPr>
         <w:t xml:space="preserve">によれば……のように書き、そうでない場合は……が提唱されている</w:t>
       </w:r>
       <w:r>
-        <w:t xml:space="preserve">（佐伯・佐々木, 1990）</w:t>
-      </w:r>
-      <w:r>
+        <w:rPr>
+          <w:rFonts w:hint="eastAsia"/>
+        </w:rPr>
+        <w:t xml:space="preserve">（佐伯・佐々木,</w:t>
+      </w:r>
+      <w:r>
+        <w:t xml:space="preserve"> </w:t>
+      </w:r>
+      <w:r>
+        <w:rPr>
+          <w:rFonts w:hint="eastAsia"/>
+        </w:rPr>
+        <w:t xml:space="preserve">1990）</w:t>
+      </w:r>
+      <w:r>
+        <w:rPr>
+          <w:rFonts w:hint="eastAsia"/>
+        </w:rPr>
         <w:t xml:space="preserve">のように書く。</w:t>
       </w:r>
     </w:p>
@@ -1116,7 +1624,22 @@
         <w:pStyle w:val="BodyText"/>
       </w:pPr>
       <w:r>
-        <w:t xml:space="preserve">文献リストは「文献」という見出しのもとに出力される。欧文と和文を区別せず、第 1 著者の姓のアルファベット順に並び、番号は付かない。和文文献には bib ファイルで</w:t>
+        <w:rPr>
+          <w:rFonts w:hint="eastAsia"/>
+        </w:rPr>
+        <w:t xml:space="preserve">文献リストは「文献」という見出しのもとに出力される。欧文と和文を区別せず、第</w:t>
+      </w:r>
+      <w:r>
+        <w:t xml:space="preserve"> 1 </w:t>
+      </w:r>
+      <w:r>
+        <w:rPr>
+          <w:rFonts w:hint="eastAsia"/>
+        </w:rPr>
+        <w:t xml:space="preserve">著者の姓のアルファベット順に並び、番号は付かない。和文文献には</w:t>
+      </w:r>
+      <w:r>
+        <w:t xml:space="preserve"> bib ファイルで</w:t>
       </w:r>
       <w:r>
         <w:t xml:space="preserve"> </w:t>
@@ -1131,6 +1654,9 @@
         <w:t xml:space="preserve"> </w:t>
       </w:r>
       <w:r>
+        <w:rPr>
+          <w:rFonts w:hint="eastAsia"/>
+        </w:rPr>
         <w:t xml:space="preserve">を付け、正しい位置に並ぶよう</w:t>
       </w:r>
       <w:r>
@@ -1146,19 +1672,34 @@
         <w:t xml:space="preserve"> </w:t>
       </w:r>
       <w:r>
+        <w:rPr>
+          <w:rFonts w:hint="eastAsia"/>
+        </w:rPr>
         <w:t xml:space="preserve">にローマ字読みを書き、キーもローマ字（姓＋年）にする。以下は要項に挙げられた例をすべて引用したものである：</w:t>
       </w:r>
       <w:r>
         <w:t xml:space="preserve"> </w:t>
       </w:r>
       <w:r>
-        <w:t xml:space="preserve">Miller （1956）</w:t>
+        <w:t xml:space="preserve">Miller </w:t>
+      </w:r>
+      <w:r>
+        <w:rPr>
+          <w:rFonts w:hint="eastAsia"/>
+        </w:rPr>
+        <w:t xml:space="preserve">（1956）</w:t>
       </w:r>
       <w:r>
         <w:t xml:space="preserve">、</w:t>
       </w:r>
       <w:r>
-        <w:t xml:space="preserve">Cohen &amp; Levesque （1985）</w:t>
+        <w:t xml:space="preserve">Cohen &amp; Levesque </w:t>
+      </w:r>
+      <w:r>
+        <w:rPr>
+          <w:rFonts w:hint="eastAsia"/>
+        </w:rPr>
+        <w:t xml:space="preserve">（1985）</w:t>
       </w:r>
       <w:r>
         <w:t xml:space="preserve">、Minsky</w:t>
@@ -1167,13 +1708,37 @@
         <w:t xml:space="preserve"> </w:t>
       </w:r>
       <w:r>
-        <w:t xml:space="preserve">（1986a, 1986b）</w:t>
+        <w:rPr>
+          <w:rFonts w:hint="eastAsia"/>
+        </w:rPr>
+        <w:t xml:space="preserve">（1986a,</w:t>
+      </w:r>
+      <w:r>
+        <w:t xml:space="preserve"> </w:t>
+      </w:r>
+      <w:r>
+        <w:rPr>
+          <w:rFonts w:hint="eastAsia"/>
+        </w:rPr>
+        <w:t xml:space="preserve">1986b）</w:t>
       </w:r>
       <w:r>
         <w:t xml:space="preserve">、</w:t>
       </w:r>
       <w:r>
-        <w:t xml:space="preserve">佐伯・佐々木 （1990）</w:t>
+        <w:rPr>
+          <w:rFonts w:hint="eastAsia"/>
+        </w:rPr>
+        <w:t xml:space="preserve">佐伯・佐々木</w:t>
+      </w:r>
+      <w:r>
+        <w:t xml:space="preserve"> </w:t>
+      </w:r>
+      <w:r>
+        <w:rPr>
+          <w:rFonts w:hint="eastAsia"/>
+        </w:rPr>
+        <w:t xml:space="preserve">（1990）</w:t>
       </w:r>
       <w:r>
         <w:t xml:space="preserve">、</w:t>
@@ -1182,25 +1747,49 @@
         <w:t xml:space="preserve"> </w:t>
       </w:r>
       <w:r>
-        <w:t xml:space="preserve">Minsky （1975）</w:t>
+        <w:t xml:space="preserve">Minsky </w:t>
+      </w:r>
+      <w:r>
+        <w:rPr>
+          <w:rFonts w:hint="eastAsia"/>
+        </w:rPr>
+        <w:t xml:space="preserve">（1975）</w:t>
       </w:r>
       <w:r>
         <w:t xml:space="preserve">、</w:t>
       </w:r>
       <w:r>
-        <w:t xml:space="preserve">Perrault （1990）</w:t>
+        <w:t xml:space="preserve">Perrault </w:t>
+      </w:r>
+      <w:r>
+        <w:rPr>
+          <w:rFonts w:hint="eastAsia"/>
+        </w:rPr>
+        <w:t xml:space="preserve">（1990）</w:t>
       </w:r>
       <w:r>
         <w:t xml:space="preserve">、</w:t>
       </w:r>
       <w:r>
-        <w:t xml:space="preserve">Rosenschein （1987）</w:t>
+        <w:t xml:space="preserve">Rosenschein </w:t>
+      </w:r>
+      <w:r>
+        <w:rPr>
+          <w:rFonts w:hint="eastAsia"/>
+        </w:rPr>
+        <w:t xml:space="preserve">（1987）</w:t>
       </w:r>
       <w:r>
         <w:t xml:space="preserve">、</w:t>
       </w:r>
       <w:r>
-        <w:t xml:space="preserve">Devins （1981）</w:t>
+        <w:t xml:space="preserve">Devins </w:t>
+      </w:r>
+      <w:r>
+        <w:rPr>
+          <w:rFonts w:hint="eastAsia"/>
+        </w:rPr>
+        <w:t xml:space="preserve">（1981）</w:t>
       </w:r>
       <w:r>
         <w:t xml:space="preserve">。</w:t>
@@ -1219,13 +1808,40 @@
         <w:pStyle w:val="FirstParagraph"/>
       </w:pPr>
       <w:r>
+        <w:rPr>
+          <w:rFonts w:hint="eastAsia"/>
+        </w:rPr>
         <w:t xml:space="preserve">本テンプレートは非公式の叩き台である。判型・字詰め・フォントサイズなどは、</w:t>
       </w:r>
       <w:r>
         <w:t xml:space="preserve"> </w:t>
       </w:r>
       <w:r>
-        <w:t xml:space="preserve">LaTeX 版は刊行された論文の組版に、Word 版は学会事務局の Word テンプレートに合わせている。</w:t>
+        <w:t xml:space="preserve">LaTeX </w:t>
+      </w:r>
+      <w:r>
+        <w:rPr>
+          <w:rFonts w:hint="eastAsia"/>
+        </w:rPr>
+        <w:t xml:space="preserve">版は刊行された論文の組版に、Word</w:t>
+      </w:r>
+      <w:r>
+        <w:t xml:space="preserve"> </w:t>
+      </w:r>
+      <w:r>
+        <w:rPr>
+          <w:rFonts w:hint="eastAsia"/>
+        </w:rPr>
+        <w:t xml:space="preserve">版は学会事務局の</w:t>
+      </w:r>
+      <w:r>
+        <w:t xml:space="preserve"> Word </w:t>
+      </w:r>
+      <w:r>
+        <w:rPr>
+          <w:rFonts w:hint="eastAsia"/>
+        </w:rPr>
+        <w:t xml:space="preserve">テンプレートに合わせている。</w:t>
       </w:r>
     </w:p>
     <w:p>
@@ -1233,6 +1849,9 @@
         <w:pStyle w:val="Heading1"/>
       </w:pPr>
       <w:r>
+        <w:rPr>
+          <w:rFonts w:hint="eastAsia"/>
+        </w:rPr>
         <w:t xml:space="preserve">謝辞</w:t>
       </w:r>
     </w:p>
@@ -1241,6 +1860,9 @@
         <w:pStyle w:val="FirstParagraph"/>
       </w:pPr>
       <w:r>
+        <w:rPr>
+          <w:rFonts w:hint="eastAsia"/>
+        </w:rPr>
         <w:t xml:space="preserve">謝辞は本文の後、文献の前に置く。</w:t>
       </w:r>
     </w:p>
@@ -1249,73 +1871,269 @@
         <w:pStyle w:val="Heading1"/>
       </w:pPr>
       <w:r>
+        <w:rPr>
+          <w:rFonts w:hint="eastAsia"/>
+        </w:rPr>
         <w:t xml:space="preserve">文献</w:t>
       </w:r>
     </w:p>
-    <w:bookmarkStart w:id="41" w:name="refs"/>
-    <w:bookmarkStart w:id="24" w:name="ref-anzai1992"/>
+    <w:bookmarkStart w:id="39" w:name="refs"/>
+    <w:bookmarkStart w:id="22" w:name="ref-anzai1992"/>
     <w:p>
       <w:pPr>
         <w:pStyle w:val="Bibliography"/>
       </w:pPr>
       <w:r>
-        <w:t xml:space="preserve">安西 祐一郎・山田 太郎・鈴木 花子（1992）．認知科学における知識表現の諸問題．『認知科学』,</w:t>
-      </w:r>
-      <w:r>
-        <w:t xml:space="preserve"> </w:t>
-      </w:r>
-      <w:r>
-        <w:rPr>
+        <w:rPr>
+          <w:rFonts w:hint="eastAsia"/>
+        </w:rPr>
+        <w:t xml:space="preserve">安西</w:t>
+      </w:r>
+      <w:r>
+        <w:t xml:space="preserve"> </w:t>
+      </w:r>
+      <w:r>
+        <w:rPr>
+          <w:rFonts w:hint="eastAsia"/>
+        </w:rPr>
+        <w:t xml:space="preserve">祐一郎・山田</w:t>
+      </w:r>
+      <w:r>
+        <w:t xml:space="preserve"> </w:t>
+      </w:r>
+      <w:r>
+        <w:rPr>
+          <w:rFonts w:hint="eastAsia"/>
+        </w:rPr>
+        <w:t xml:space="preserve">太郎・鈴木</w:t>
+      </w:r>
+      <w:r>
+        <w:t xml:space="preserve"> </w:t>
+      </w:r>
+      <w:r>
+        <w:rPr>
+          <w:rFonts w:hint="eastAsia"/>
+        </w:rPr>
+        <w:t xml:space="preserve">花子（1992）．認知科学における知識表現の諸問題．『認知科学』,</w:t>
+      </w:r>
+      <w:r>
+        <w:t xml:space="preserve"> </w:t>
+      </w:r>
+      <w:r>
+        <w:rPr>
+          <w:b/>
           <w:bCs/>
+        </w:rPr>
+        <w:t xml:space="preserve">1</w:t>
+      </w:r>
+      <w:r>
+        <w:rPr>
+          <w:rFonts w:hint="eastAsia"/>
+        </w:rPr>
+        <w:t xml:space="preserve">（2）,</w:t>
+      </w:r>
+      <w:r>
+        <w:t xml:space="preserve"> </w:t>
+      </w:r>
+      <w:r>
+        <w:rPr>
+          <w:rFonts w:hint="eastAsia"/>
+        </w:rPr>
+        <w:t xml:space="preserve">1–20．</w:t>
+      </w:r>
+    </w:p>
+    <w:bookmarkEnd w:id="22"/>
+    <w:bookmarkStart w:id="23" w:name="ref-cohen1985"/>
+    <w:p>
+      <w:pPr>
+        <w:pStyle w:val="Bibliography"/>
+      </w:pPr>
+      <w:r>
+        <w:t xml:space="preserve">Cohen, P. R. &amp; Levesque, H. J. (1985). Speech Acts and Rationality.</w:t>
+      </w:r>
+      <w:r>
+        <w:t xml:space="preserve"> </w:t>
+      </w:r>
+      <w:r>
+        <w:rPr>
+          <w:i/>
+          <w:iCs/>
+        </w:rPr>
+        <w:t xml:space="preserve">Proceedings of the 23rd Annual Meeting of the Association for Computational Linguistics</w:t>
+      </w:r>
+      <w:r>
+        <w:t xml:space="preserve">, 49–60.</w:t>
+      </w:r>
+    </w:p>
+    <w:bookmarkEnd w:id="23"/>
+    <w:bookmarkStart w:id="24" w:name="ref-cohen1990a"/>
+    <w:p>
+      <w:pPr>
+        <w:pStyle w:val="Bibliography"/>
+      </w:pPr>
+      <w:r>
+        <w:t xml:space="preserve">Cohen, P. R. &amp; Levesque, H. J. (1990a). Intention Is Choice with Commitment.</w:t>
+      </w:r>
+      <w:r>
+        <w:t xml:space="preserve"> </w:t>
+      </w:r>
+      <w:r>
+        <w:rPr>
+          <w:i/>
+          <w:iCs/>
+        </w:rPr>
+        <w:t xml:space="preserve">Artificial Intelligence</w:t>
+      </w:r>
+      <w:r>
+        <w:t xml:space="preserve">,</w:t>
+      </w:r>
+      <w:r>
+        <w:t xml:space="preserve"> </w:t>
+      </w:r>
+      <w:r>
+        <w:rPr>
           <w:b/>
-        </w:rPr>
-        <w:t xml:space="preserve">1</w:t>
-      </w:r>
-      <w:r>
-        <w:t xml:space="preserve">（2）, 1–20．</w:t>
+          <w:bCs/>
+        </w:rPr>
+        <w:t xml:space="preserve">42</w:t>
+      </w:r>
+      <w:r>
+        <w:t xml:space="preserve">(2-3), 213–261.</w:t>
       </w:r>
     </w:p>
     <w:bookmarkEnd w:id="24"/>
-    <w:bookmarkStart w:id="25" w:name="ref-cohen1985"/>
+    <w:bookmarkStart w:id="25" w:name="ref-cohen1990b"/>
     <w:p>
       <w:pPr>
         <w:pStyle w:val="Bibliography"/>
       </w:pPr>
       <w:r>
-        <w:t xml:space="preserve">Cohen, P. R. &amp; Levesque, H. J. (1985). Speech Acts and Rationality.</w:t>
-      </w:r>
-      <w:r>
-        <w:t xml:space="preserve"> </w:t>
-      </w:r>
-      <w:r>
-        <w:rPr>
+        <w:t xml:space="preserve">Cohen, P. R. &amp; Levesque, H. J. (1990b). Rational Interaction as the Basis for Communication. In P. R. Cohen, J. Morgan &amp; M. E. Pollack (Eds.),</w:t>
+      </w:r>
+      <w:r>
+        <w:t xml:space="preserve"> </w:t>
+      </w:r>
+      <w:r>
+        <w:rPr>
+          <w:i/>
           <w:iCs/>
+        </w:rPr>
+        <w:t xml:space="preserve">Intentions in Communication</w:t>
+      </w:r>
+      <w:r>
+        <w:t xml:space="preserve">, 221–255. Cambridge, MA: MIT Press.</w:t>
+      </w:r>
+    </w:p>
+    <w:bookmarkEnd w:id="25"/>
+    <w:bookmarkStart w:id="26" w:name="ref-devins1981"/>
+    <w:p>
+      <w:pPr>
+        <w:pStyle w:val="Bibliography"/>
+      </w:pPr>
+      <w:r>
+        <w:t xml:space="preserve">Devins, G. M. (1981).</w:t>
+      </w:r>
+      <w:r>
+        <w:t xml:space="preserve"> </w:t>
+      </w:r>
+      <w:r>
+        <w:rPr>
           <w:i/>
-        </w:rPr>
-        <w:t xml:space="preserve">Proceedings of the 23rd Annual Meeting of the Association for Computational Linguistics</w:t>
-      </w:r>
-      <w:r>
-        <w:t xml:space="preserve">, 49–60.</w:t>
-      </w:r>
-    </w:p>
-    <w:bookmarkEnd w:id="25"/>
-    <w:bookmarkStart w:id="26" w:name="ref-cohen1990a"/>
+          <w:iCs/>
+        </w:rPr>
+        <w:t xml:space="preserve">Helplessness, Depression, and Mood in Endstage Renal Disease</w:t>
+      </w:r>
+      <w:r>
+        <w:t xml:space="preserve">, Doctoral dissertation. Montreal: McGill University.</w:t>
+      </w:r>
+    </w:p>
+    <w:bookmarkEnd w:id="26"/>
+    <w:bookmarkStart w:id="27" w:name="ref-gibson1979"/>
     <w:p>
       <w:pPr>
         <w:pStyle w:val="Bibliography"/>
       </w:pPr>
       <w:r>
-        <w:t xml:space="preserve">Cohen, P. R. &amp; Levesque, H. J. (1990a). Intention Is Choice with Commitment.</w:t>
-      </w:r>
-      <w:r>
-        <w:t xml:space="preserve"> </w:t>
-      </w:r>
-      <w:r>
-        <w:rPr>
+        <w:t xml:space="preserve">Gibson, J. J. (1979).</w:t>
+      </w:r>
+      <w:r>
+        <w:t xml:space="preserve"> </w:t>
+      </w:r>
+      <w:r>
+        <w:rPr>
+          <w:i/>
           <w:iCs/>
+        </w:rPr>
+        <w:t xml:space="preserve">The Ecological Approach to Visual Perception</w:t>
+      </w:r>
+      <w:r>
+        <w:t xml:space="preserve">. Boston: Houghton Mifflin.</w:t>
+      </w:r>
+    </w:p>
+    <w:bookmarkEnd w:id="27"/>
+    <w:bookmarkStart w:id="28" w:name="ref-haugeland1987"/>
+    <w:p>
+      <w:pPr>
+        <w:pStyle w:val="Bibliography"/>
+      </w:pPr>
+      <w:r>
+        <w:t xml:space="preserve">Haugeland, J. (1987).</w:t>
+      </w:r>
+      <w:r>
+        <w:t xml:space="preserve"> </w:t>
+      </w:r>
+      <w:r>
+        <w:rPr>
           <w:i/>
-        </w:rPr>
-        <w:t xml:space="preserve">Artificial Intelligence</w:t>
+          <w:iCs/>
+        </w:rPr>
+        <w:t xml:space="preserve">Artificial Intelligence: The Very Idea</w:t>
+      </w:r>
+      <w:r>
+        <w:t xml:space="preserve">. Cambridge, MA: MIT Press.</w:t>
+      </w:r>
+    </w:p>
+    <w:bookmarkEnd w:id="28"/>
+    <w:bookmarkStart w:id="29" w:name="ref-joshi1981"/>
+    <w:p>
+      <w:pPr>
+        <w:pStyle w:val="Bibliography"/>
+      </w:pPr>
+      <w:r>
+        <w:t xml:space="preserve">Joshi, A. K., Webber, B. L. &amp; Sag, I. A. (1981). Elements of Discourse Understanding.</w:t>
+      </w:r>
+      <w:r>
+        <w:t xml:space="preserve"> </w:t>
+      </w:r>
+      <w:r>
+        <w:rPr>
+          <w:i/>
+          <w:iCs/>
+        </w:rPr>
+        <w:t xml:space="preserve">Proceedings of the Workshop on Computational Aspects of Linguistic Structure and Discourse Setting</w:t>
+      </w:r>
+      <w:r>
+        <w:t xml:space="preserve">. Cambridge: Cambridge University Press.</w:t>
+      </w:r>
+    </w:p>
+    <w:bookmarkEnd w:id="29"/>
+    <w:bookmarkStart w:id="30" w:name="ref-miller1956"/>
+    <w:p>
+      <w:pPr>
+        <w:pStyle w:val="Bibliography"/>
+      </w:pPr>
+      <w:r>
+        <w:t xml:space="preserve">Miller, G. A. (1956). The Magical Number Seven, Plus or Minus Two: Some Limits on Our Capacity for Processing Information.</w:t>
+      </w:r>
+      <w:r>
+        <w:t xml:space="preserve"> </w:t>
+      </w:r>
+      <w:r>
+        <w:rPr>
+          <w:i/>
+          <w:iCs/>
+        </w:rPr>
+        <w:t xml:space="preserve">Psychological Review</w:t>
       </w:r>
       <w:r>
         <w:t xml:space="preserve">,</w:t>
@@ -1325,382 +2143,426 @@
       </w:r>
       <w:r>
         <w:rPr>
+          <w:b/>
           <w:bCs/>
+        </w:rPr>
+        <w:t xml:space="preserve">63</w:t>
+      </w:r>
+      <w:r>
+        <w:t xml:space="preserve">(1), 81–97.</w:t>
+      </w:r>
+    </w:p>
+    <w:bookmarkEnd w:id="30"/>
+    <w:bookmarkStart w:id="31" w:name="ref-minsky1975"/>
+    <w:p>
+      <w:pPr>
+        <w:pStyle w:val="Bibliography"/>
+      </w:pPr>
+      <w:r>
+        <w:t xml:space="preserve">Minsky, M. (1975). A Framework for Representing Knowledge. In P. Winston (Ed.),</w:t>
+      </w:r>
+      <w:r>
+        <w:t xml:space="preserve"> </w:t>
+      </w:r>
+      <w:r>
+        <w:rPr>
+          <w:i/>
+          <w:iCs/>
+        </w:rPr>
+        <w:t xml:space="preserve">Psychology of Computer Vision</w:t>
+      </w:r>
+      <w:r>
+        <w:t xml:space="preserve">. New York: McGraw-Hill. </w:t>
+      </w:r>
+      <w:r>
+        <w:rPr>
+          <w:rFonts w:hint="eastAsia"/>
+        </w:rPr>
+        <w:t xml:space="preserve">（白井</w:t>
+      </w:r>
+      <w:r>
+        <w:t xml:space="preserve"> </w:t>
+      </w:r>
+      <w:r>
+        <w:rPr>
+          <w:rFonts w:hint="eastAsia"/>
+        </w:rPr>
+        <w:t xml:space="preserve">良明・杉原</w:t>
+      </w:r>
+      <w:r>
+        <w:t xml:space="preserve"> </w:t>
+      </w:r>
+      <w:r>
+        <w:rPr>
+          <w:rFonts w:hint="eastAsia"/>
+        </w:rPr>
+        <w:t xml:space="preserve">厚吉</w:t>
+      </w:r>
+      <w:r>
+        <w:t xml:space="preserve"> </w:t>
+      </w:r>
+      <w:r>
+        <w:rPr>
+          <w:rFonts w:hint="eastAsia"/>
+        </w:rPr>
+        <w:t xml:space="preserve">訳（1979）．知識を表現するための枠組．『コンピュータビジョンの心理』．東京:</w:t>
+      </w:r>
+      <w:r>
+        <w:t xml:space="preserve"> </w:t>
+      </w:r>
+      <w:r>
+        <w:rPr>
+          <w:rFonts w:hint="eastAsia"/>
+        </w:rPr>
+        <w:t xml:space="preserve">産業図書．）</w:t>
+      </w:r>
+    </w:p>
+    <w:bookmarkEnd w:id="31"/>
+    <w:bookmarkStart w:id="32" w:name="ref-minsky1986"/>
+    <w:p>
+      <w:pPr>
+        <w:pStyle w:val="Bibliography"/>
+      </w:pPr>
+      <w:r>
+        <w:t xml:space="preserve">Minsky, M. (1986a).</w:t>
+      </w:r>
+      <w:r>
+        <w:t xml:space="preserve"> </w:t>
+      </w:r>
+      <w:r>
+        <w:rPr>
+          <w:i/>
+          <w:iCs/>
+        </w:rPr>
+        <w:t xml:space="preserve">Society of Mind</w:t>
+      </w:r>
+      <w:r>
+        <w:t xml:space="preserve">. New York:</w:t>
+      </w:r>
+      <w:r>
+        <w:t xml:space="preserve"> </w:t>
+      </w:r>
+      <w:r>
+        <w:t xml:space="preserve">Simon and Schuster</w:t>
+      </w:r>
+      <w:r>
+        <w:t xml:space="preserve">. </w:t>
+      </w:r>
+      <w:r>
+        <w:rPr>
+          <w:rFonts w:hint="eastAsia"/>
+        </w:rPr>
+        <w:t xml:space="preserve">（安西</w:t>
+      </w:r>
+      <w:r>
+        <w:t xml:space="preserve"> </w:t>
+      </w:r>
+      <w:r>
+        <w:rPr>
+          <w:rFonts w:hint="eastAsia"/>
+        </w:rPr>
+        <w:t xml:space="preserve">祐一郎</w:t>
+      </w:r>
+      <w:r>
+        <w:t xml:space="preserve"> </w:t>
+      </w:r>
+      <w:r>
+        <w:rPr>
+          <w:rFonts w:hint="eastAsia"/>
+        </w:rPr>
+        <w:t xml:space="preserve">訳</w:t>
+      </w:r>
+      <w:r>
+        <w:t xml:space="preserve"> </w:t>
+      </w:r>
+      <w:r>
+        <w:rPr>
+          <w:rFonts w:hint="eastAsia"/>
+        </w:rPr>
+        <w:t xml:space="preserve">(1990).『心の社会』.</w:t>
+      </w:r>
+      <w:r>
+        <w:t xml:space="preserve"> </w:t>
+      </w:r>
+      <w:r>
+        <w:rPr>
+          <w:rFonts w:hint="eastAsia"/>
+        </w:rPr>
+        <w:t xml:space="preserve">東京:</w:t>
+      </w:r>
+      <w:r>
+        <w:t xml:space="preserve"> </w:t>
+      </w:r>
+      <w:r>
+        <w:rPr>
+          <w:rFonts w:hint="eastAsia"/>
+        </w:rPr>
+        <w:t xml:space="preserve">産業図書．）</w:t>
+      </w:r>
+    </w:p>
+    <w:bookmarkEnd w:id="32"/>
+    <w:bookmarkStart w:id="33" w:name="ref-minsky1986b"/>
+    <w:p>
+      <w:pPr>
+        <w:pStyle w:val="Bibliography"/>
+      </w:pPr>
+      <w:r>
+        <w:t xml:space="preserve">Minsky, M. (1986b).</w:t>
+      </w:r>
+      <w:r>
+        <w:t xml:space="preserve"> </w:t>
+      </w:r>
+      <w:r>
+        <w:rPr>
+          <w:i/>
+          <w:iCs/>
+        </w:rPr>
+        <w:t xml:space="preserve">The Society of Mind (Paperback Edition)</w:t>
+      </w:r>
+      <w:r>
+        <w:t xml:space="preserve">. New York:</w:t>
+      </w:r>
+      <w:r>
+        <w:t xml:space="preserve"> </w:t>
+      </w:r>
+      <w:r>
+        <w:t xml:space="preserve">Simon and Schuster</w:t>
+      </w:r>
+      <w:r>
+        <w:t xml:space="preserve">. </w:t>
+      </w:r>
+      <w:r>
+        <w:rPr>
+          <w:rFonts w:hint="eastAsia"/>
+        </w:rPr>
+        <w:t xml:space="preserve">（同一著者・同一年の例（1986b</w:t>
+      </w:r>
+      <w:r>
+        <w:t xml:space="preserve"> </w:t>
+      </w:r>
+      <w:r>
+        <w:rPr>
+          <w:rFonts w:hint="eastAsia"/>
+        </w:rPr>
+        <w:t xml:space="preserve">になる））</w:t>
+      </w:r>
+    </w:p>
+    <w:bookmarkEnd w:id="33"/>
+    <w:bookmarkStart w:id="34" w:name="ref-perrault1990b"/>
+    <w:p>
+      <w:pPr>
+        <w:pStyle w:val="Bibliography"/>
+      </w:pPr>
+      <w:r>
+        <w:t xml:space="preserve">Perrault, C. R. (1990). An Application of Default Logic to Speech Act Theory. In P. R. Cohen, J. Morgan &amp; M. E. Pollack (Eds.),</w:t>
+      </w:r>
+      <w:r>
+        <w:t xml:space="preserve"> </w:t>
+      </w:r>
+      <w:r>
+        <w:rPr>
+          <w:i/>
+          <w:iCs/>
+        </w:rPr>
+        <w:t xml:space="preserve">Intentions in Communication</w:t>
+      </w:r>
+      <w:r>
+        <w:t xml:space="preserve">, 161–185. Cambridge, MA: MIT Press.</w:t>
+      </w:r>
+    </w:p>
+    <w:bookmarkEnd w:id="34"/>
+    <w:bookmarkStart w:id="35" w:name="ref-rosenschein1987"/>
+    <w:p>
+      <w:pPr>
+        <w:pStyle w:val="Bibliography"/>
+      </w:pPr>
+      <w:r>
+        <w:t xml:space="preserve">Rosenschein, S. (1987).</w:t>
+      </w:r>
+      <w:r>
+        <w:t xml:space="preserve"> </w:t>
+      </w:r>
+      <w:r>
+        <w:rPr>
+          <w:i/>
+          <w:iCs/>
+        </w:rPr>
+        <w:t xml:space="preserve">Formal Theories of Knowledge in AI and Robotics</w:t>
+      </w:r>
+      <w:r>
+        <w:t xml:space="preserve">, Report No. CSLI-87-84. Stanford:</w:t>
+      </w:r>
+      <w:r>
+        <w:t xml:space="preserve"> </w:t>
+      </w:r>
+      <w:r>
+        <w:t xml:space="preserve">Center for the Study of Language and Information, Stanford University</w:t>
+      </w:r>
+      <w:r>
+        <w:t xml:space="preserve">. </w:t>
+      </w:r>
+      <w:r>
+        <w:rPr>
+          <w:rFonts w:hint="eastAsia"/>
+        </w:rPr>
+        <w:t xml:space="preserve">（斎藤</w:t>
+      </w:r>
+      <w:r>
+        <w:t xml:space="preserve"> </w:t>
+      </w:r>
+      <w:r>
+        <w:rPr>
+          <w:rFonts w:hint="eastAsia"/>
+        </w:rPr>
+        <w:t xml:space="preserve">浩文</w:t>
+      </w:r>
+      <w:r>
+        <w:t xml:space="preserve"> </w:t>
+      </w:r>
+      <w:r>
+        <w:rPr>
+          <w:rFonts w:hint="eastAsia"/>
+        </w:rPr>
+        <w:t xml:space="preserve">訳（1990）．AI</w:t>
+      </w:r>
+      <w:r>
+        <w:t xml:space="preserve"> </w:t>
+      </w:r>
+      <w:r>
+        <w:rPr>
+          <w:rFonts w:hint="eastAsia"/>
+        </w:rPr>
+        <w:t xml:space="preserve">とロボット工学における知識の形式理論．『現代思想』．</w:t>
+      </w:r>
+      <w:r>
+        <w:rPr>
           <w:b/>
-        </w:rPr>
-        <w:t xml:space="preserve">42</w:t>
-      </w:r>
-      <w:r>
-        <w:t xml:space="preserve">(2-3), 213–261.</w:t>
-      </w:r>
-    </w:p>
-    <w:bookmarkEnd w:id="26"/>
-    <w:bookmarkStart w:id="27" w:name="ref-cohen1990b"/>
+          <w:bCs/>
+        </w:rPr>
+        <w:t xml:space="preserve">6</w:t>
+      </w:r>
+      <w:r>
+        <w:rPr>
+          <w:rFonts w:hint="eastAsia"/>
+        </w:rPr>
+        <w:t xml:space="preserve">（3）,</w:t>
+      </w:r>
+      <w:r>
+        <w:t xml:space="preserve"> </w:t>
+      </w:r>
+      <w:r>
+        <w:rPr>
+          <w:rFonts w:hint="eastAsia"/>
+        </w:rPr>
+        <w:t xml:space="preserve">127–139.）</w:t>
+      </w:r>
+    </w:p>
+    <w:bookmarkEnd w:id="35"/>
+    <w:bookmarkStart w:id="36" w:name="ref-saeki1990"/>
     <w:p>
       <w:pPr>
         <w:pStyle w:val="Bibliography"/>
       </w:pPr>
       <w:r>
-        <w:t xml:space="preserve">Cohen, P. R. &amp; Levesque, H. J. (1990b). Rational Interaction as the Basis for Communication. In P. R. Cohen, J. Morgan &amp; M. E. Pollack (Eds.),</w:t>
-      </w:r>
-      <w:r>
-        <w:t xml:space="preserve"> </w:t>
-      </w:r>
-      <w:r>
-        <w:rPr>
+        <w:rPr>
+          <w:rFonts w:hint="eastAsia"/>
+        </w:rPr>
+        <w:t xml:space="preserve">佐伯</w:t>
+      </w:r>
+      <w:r>
+        <w:t xml:space="preserve"> </w:t>
+      </w:r>
+      <w:r>
+        <w:rPr>
+          <w:rFonts w:hint="eastAsia"/>
+        </w:rPr>
+        <w:t xml:space="preserve">胖・佐々木</w:t>
+      </w:r>
+      <w:r>
+        <w:t xml:space="preserve"> </w:t>
+      </w:r>
+      <w:r>
+        <w:rPr>
+          <w:rFonts w:hint="eastAsia"/>
+        </w:rPr>
+        <w:t xml:space="preserve">正人（編）（1990）．『アクティブ・マインド』．東京:</w:t>
+      </w:r>
+      <w:r>
+        <w:t xml:space="preserve"> </w:t>
+      </w:r>
+      <w:r>
+        <w:rPr>
+          <w:rFonts w:hint="eastAsia"/>
+        </w:rPr>
+        <w:t xml:space="preserve">東京大学出版会．</w:t>
+      </w:r>
+    </w:p>
+    <w:bookmarkEnd w:id="36"/>
+    <w:bookmarkStart w:id="37" w:name="ref-simon1973"/>
+    <w:p>
+      <w:pPr>
+        <w:pStyle w:val="Bibliography"/>
+      </w:pPr>
+      <w:r>
+        <w:t xml:space="preserve">Simon, H. A. (1973).</w:t>
+      </w:r>
+      <w:r>
+        <w:t xml:space="preserve"> </w:t>
+      </w:r>
+      <w:r>
+        <w:rPr>
+          <w:i/>
           <w:iCs/>
+        </w:rPr>
+        <w:t xml:space="preserve">The Organization of Complex Systems</w:t>
+      </w:r>
+      <w:r>
+        <w:t xml:space="preserve">. New York: Braziller.</w:t>
+      </w:r>
+    </w:p>
+    <w:bookmarkEnd w:id="37"/>
+    <w:bookmarkStart w:id="38" w:name="ref-simon1981"/>
+    <w:p>
+      <w:pPr>
+        <w:pStyle w:val="Bibliography"/>
+      </w:pPr>
+      <w:r>
+        <w:t xml:space="preserve">Simon, H. A. (1981).</w:t>
+      </w:r>
+      <w:r>
+        <w:t xml:space="preserve"> </w:t>
+      </w:r>
+      <w:r>
+        <w:rPr>
           <w:i/>
-        </w:rPr>
-        <w:t xml:space="preserve">Intentions in Communication</w:t>
-      </w:r>
-      <w:r>
-        <w:t xml:space="preserve">, 221–255. Cambridge, MA: MIT Press.</w:t>
-      </w:r>
-    </w:p>
-    <w:bookmarkEnd w:id="27"/>
-    <w:bookmarkStart w:id="28" w:name="ref-devins1981"/>
-    <w:p>
-      <w:pPr>
-        <w:pStyle w:val="Bibliography"/>
-      </w:pPr>
-      <w:r>
-        <w:t xml:space="preserve">Devins, G. M. (1981).</w:t>
-      </w:r>
-      <w:r>
-        <w:t xml:space="preserve"> </w:t>
-      </w:r>
-      <w:r>
-        <w:rPr>
           <w:iCs/>
-          <w:i/>
-        </w:rPr>
-        <w:t xml:space="preserve">Helplessness, Depression, and Mood in Endstage Renal Disease</w:t>
-      </w:r>
-      <w:r>
-        <w:t xml:space="preserve">, Doctoral dissertation. Montreal: McGill University.</w:t>
-      </w:r>
-    </w:p>
-    <w:bookmarkEnd w:id="28"/>
-    <w:bookmarkStart w:id="29" w:name="ref-gibson1979"/>
-    <w:p>
-      <w:pPr>
-        <w:pStyle w:val="Bibliography"/>
-      </w:pPr>
-      <w:r>
-        <w:t xml:space="preserve">Gibson, J. J. (1979).</w:t>
-      </w:r>
-      <w:r>
-        <w:t xml:space="preserve"> </w:t>
-      </w:r>
-      <w:r>
-        <w:rPr>
-          <w:iCs/>
-          <w:i/>
-        </w:rPr>
-        <w:t xml:space="preserve">The Ecological Approach to Visual Perception</w:t>
-      </w:r>
-      <w:r>
-        <w:t xml:space="preserve">. Boston: Houghton Mifflin.</w:t>
-      </w:r>
-    </w:p>
-    <w:bookmarkEnd w:id="29"/>
-    <w:bookmarkStart w:id="30" w:name="ref-haugeland1987"/>
-    <w:p>
-      <w:pPr>
-        <w:pStyle w:val="Bibliography"/>
-      </w:pPr>
-      <w:r>
-        <w:t xml:space="preserve">Haugeland, J. (1987).</w:t>
-      </w:r>
-      <w:r>
-        <w:t xml:space="preserve"> </w:t>
-      </w:r>
-      <w:r>
-        <w:rPr>
-          <w:iCs/>
-          <w:i/>
-        </w:rPr>
-        <w:t xml:space="preserve">Artificial Intelligence: The Very Idea</w:t>
-      </w:r>
-      <w:r>
-        <w:t xml:space="preserve">. Cambridge, MA: MIT Press.</w:t>
-      </w:r>
-    </w:p>
-    <w:bookmarkEnd w:id="30"/>
-    <w:bookmarkStart w:id="31" w:name="ref-joshi1981"/>
-    <w:p>
-      <w:pPr>
-        <w:pStyle w:val="Bibliography"/>
-      </w:pPr>
-      <w:r>
-        <w:t xml:space="preserve">Joshi, A. K., Webber, B. L. &amp; Sag, I. A. (1981). Elements of Discourse Understanding.</w:t>
-      </w:r>
-      <w:r>
-        <w:t xml:space="preserve"> </w:t>
-      </w:r>
-      <w:r>
-        <w:rPr>
-          <w:iCs/>
-          <w:i/>
-        </w:rPr>
-        <w:t xml:space="preserve">Proceedings of the Workshop on Computational Aspects of Linguistic Structure and Discourse Setting</w:t>
-      </w:r>
-      <w:r>
-        <w:t xml:space="preserve">. Cambridge: Cambridge University Press.</w:t>
-      </w:r>
-    </w:p>
-    <w:bookmarkEnd w:id="31"/>
-    <w:bookmarkStart w:id="32" w:name="ref-miller1956"/>
-    <w:p>
-      <w:pPr>
-        <w:pStyle w:val="Bibliography"/>
-      </w:pPr>
-      <w:r>
-        <w:t xml:space="preserve">Miller, G. A. (1956). The Magical Number Seven, Plus or Minus Two: Some Limits on Our Capacity for Processing Information.</w:t>
-      </w:r>
-      <w:r>
-        <w:t xml:space="preserve"> </w:t>
-      </w:r>
-      <w:r>
-        <w:rPr>
-          <w:iCs/>
-          <w:i/>
-        </w:rPr>
-        <w:t xml:space="preserve">Psychological Review</w:t>
-      </w:r>
-      <w:r>
-        <w:t xml:space="preserve">,</w:t>
-      </w:r>
-      <w:r>
-        <w:t xml:space="preserve"> </w:t>
-      </w:r>
-      <w:r>
-        <w:rPr>
-          <w:bCs/>
-          <w:b/>
-        </w:rPr>
-        <w:t xml:space="preserve">63</w:t>
-      </w:r>
-      <w:r>
-        <w:t xml:space="preserve">(1), 81–97.</w:t>
-      </w:r>
-    </w:p>
-    <w:bookmarkEnd w:id="32"/>
-    <w:bookmarkStart w:id="33" w:name="ref-minsky1975"/>
-    <w:p>
-      <w:pPr>
-        <w:pStyle w:val="Bibliography"/>
-      </w:pPr>
-      <w:r>
-        <w:t xml:space="preserve">Minsky, M. (1975). A Framework for Representing Knowledge. In P. Winston (Ed.),</w:t>
-      </w:r>
-      <w:r>
-        <w:t xml:space="preserve"> </w:t>
-      </w:r>
-      <w:r>
-        <w:rPr>
-          <w:iCs/>
-          <w:i/>
-        </w:rPr>
-        <w:t xml:space="preserve">Psychology of Computer Vision</w:t>
-      </w:r>
-      <w:r>
-        <w:t xml:space="preserve">. New York: McGraw-Hill. （白井 良明・杉原 厚吉 訳（1979）．知識を表現するための枠組．『コンピュータビジョンの心理』．東京: 産業図書．）</w:t>
-      </w:r>
-    </w:p>
-    <w:bookmarkEnd w:id="33"/>
-    <w:bookmarkStart w:id="34" w:name="ref-minsky1986"/>
-    <w:p>
-      <w:pPr>
-        <w:pStyle w:val="Bibliography"/>
-      </w:pPr>
-      <w:r>
-        <w:t xml:space="preserve">Minsky, M. (1986a).</w:t>
-      </w:r>
-      <w:r>
-        <w:t xml:space="preserve"> </w:t>
-      </w:r>
-      <w:r>
-        <w:rPr>
-          <w:iCs/>
-          <w:i/>
-        </w:rPr>
-        <w:t xml:space="preserve">Society of Mind</w:t>
-      </w:r>
-      <w:r>
-        <w:t xml:space="preserve">. New York:</w:t>
-      </w:r>
-      <w:r>
-        <w:t xml:space="preserve"> </w:t>
-      </w:r>
-      <w:r>
-        <w:t xml:space="preserve">Simon and Schuster</w:t>
-      </w:r>
-      <w:r>
-        <w:t xml:space="preserve">. （安西 祐一郎 訳 (1990).『心の社会』. 東京: 産業図書．）</w:t>
-      </w:r>
-    </w:p>
-    <w:bookmarkEnd w:id="34"/>
-    <w:bookmarkStart w:id="35" w:name="ref-minsky1986b"/>
-    <w:p>
-      <w:pPr>
-        <w:pStyle w:val="Bibliography"/>
-      </w:pPr>
-      <w:r>
-        <w:t xml:space="preserve">Minsky, M. (1986b).</w:t>
-      </w:r>
-      <w:r>
-        <w:t xml:space="preserve"> </w:t>
-      </w:r>
-      <w:r>
-        <w:rPr>
-          <w:iCs/>
-          <w:i/>
-        </w:rPr>
-        <w:t xml:space="preserve">The Society of Mind (Paperback Edition)</w:t>
-      </w:r>
-      <w:r>
-        <w:t xml:space="preserve">. New York:</w:t>
-      </w:r>
-      <w:r>
-        <w:t xml:space="preserve"> </w:t>
-      </w:r>
-      <w:r>
-        <w:t xml:space="preserve">Simon and Schuster</w:t>
-      </w:r>
-      <w:r>
-        <w:t xml:space="preserve">. （同一著者・同一年の例（1986b になる））</w:t>
-      </w:r>
-    </w:p>
-    <w:bookmarkEnd w:id="35"/>
-    <w:bookmarkStart w:id="36" w:name="ref-perrault1990b"/>
-    <w:p>
-      <w:pPr>
-        <w:pStyle w:val="Bibliography"/>
-      </w:pPr>
-      <w:r>
-        <w:t xml:space="preserve">Perrault, C. R. (1990). An Application of Default Logic to Speech Act Theory. In P. R. Cohen, J. Morgan &amp; M. E. Pollack (Eds.),</w:t>
-      </w:r>
-      <w:r>
-        <w:t xml:space="preserve"> </w:t>
-      </w:r>
-      <w:r>
-        <w:rPr>
-          <w:iCs/>
-          <w:i/>
-        </w:rPr>
-        <w:t xml:space="preserve">Intentions in Communication</w:t>
-      </w:r>
-      <w:r>
-        <w:t xml:space="preserve">, 161–185. Cambridge, MA: MIT Press.</w:t>
-      </w:r>
-    </w:p>
-    <w:bookmarkEnd w:id="36"/>
-    <w:bookmarkStart w:id="37" w:name="ref-rosenschein1987"/>
-    <w:p>
-      <w:pPr>
-        <w:pStyle w:val="Bibliography"/>
-      </w:pPr>
-      <w:r>
-        <w:t xml:space="preserve">Rosenschein, S. (1987).</w:t>
-      </w:r>
-      <w:r>
-        <w:t xml:space="preserve"> </w:t>
-      </w:r>
-      <w:r>
-        <w:rPr>
-          <w:iCs/>
-          <w:i/>
-        </w:rPr>
-        <w:t xml:space="preserve">Formal Theories of Knowledge in AI and Robotics</w:t>
-      </w:r>
-      <w:r>
-        <w:t xml:space="preserve">, Report No. CSLI-87-84. Stanford:</w:t>
-      </w:r>
-      <w:r>
-        <w:t xml:space="preserve"> </w:t>
-      </w:r>
-      <w:r>
-        <w:t xml:space="preserve">Center for the Study of Language and Information, Stanford University</w:t>
-      </w:r>
-      <w:r>
-        <w:t xml:space="preserve">. （斎藤 浩文 訳（1990）．AI とロボット工学における知識の形式理論．『現代思想』．</w:t>
-      </w:r>
-      <w:r>
-        <w:rPr>
-          <w:bCs/>
-          <w:b/>
-        </w:rPr>
-        <w:t xml:space="preserve">6</w:t>
-      </w:r>
-      <w:r>
-        <w:t xml:space="preserve">（3）, 127–139.）</w:t>
-      </w:r>
-    </w:p>
-    <w:bookmarkEnd w:id="37"/>
-    <w:bookmarkStart w:id="38" w:name="ref-saeki1990"/>
-    <w:p>
-      <w:pPr>
-        <w:pStyle w:val="Bibliography"/>
-      </w:pPr>
-      <w:r>
-        <w:t xml:space="preserve">佐伯 胖・佐々木 正人（編）（1990）．『アクティブ・マインド』．東京: 東京大学出版会．</w:t>
+        </w:rPr>
+        <w:t xml:space="preserve">The Sciences of the Artificial</w:t>
+      </w:r>
+      <w:r>
+        <w:t xml:space="preserve">. 2nd ed. Cambridge, MA: MIT Press.</w:t>
       </w:r>
     </w:p>
     <w:bookmarkEnd w:id="38"/>
-    <w:bookmarkStart w:id="39" w:name="ref-simon1973"/>
-    <w:p>
-      <w:pPr>
-        <w:pStyle w:val="Bibliography"/>
-      </w:pPr>
-      <w:r>
-        <w:t xml:space="preserve">Simon, H. A. (1973).</w:t>
-      </w:r>
-      <w:r>
-        <w:t xml:space="preserve"> </w:t>
-      </w:r>
-      <w:r>
-        <w:rPr>
-          <w:iCs/>
-          <w:i/>
-        </w:rPr>
-        <w:t xml:space="preserve">The Organization of Complex Systems</w:t>
-      </w:r>
-      <w:r>
-        <w:t xml:space="preserve">. New York: Braziller.</w:t>
-      </w:r>
-    </w:p>
     <w:bookmarkEnd w:id="39"/>
-    <w:bookmarkStart w:id="40" w:name="ref-simon1981"/>
-    <w:p>
-      <w:pPr>
-        <w:pStyle w:val="Bibliography"/>
-      </w:pPr>
-      <w:r>
-        <w:t xml:space="preserve">Simon, H. A. (1981).</w:t>
-      </w:r>
-      <w:r>
-        <w:t xml:space="preserve"> </w:t>
-      </w:r>
-      <w:r>
-        <w:rPr>
-          <w:iCs/>
-          <w:i/>
-        </w:rPr>
-        <w:t xml:space="preserve">The Sciences of the Artificial</w:t>
-      </w:r>
-      <w:r>
-        <w:t xml:space="preserve">. 2nd ed. Cambridge, MA: MIT Press.</w:t>
-      </w:r>
-    </w:p>
-    <w:bookmarkEnd w:id="40"/>
-    <w:bookmarkEnd w:id="41"/>
     <w:p>
       <w:pPr>
         <w:pStyle w:val="Heading1"/>
       </w:pPr>
       <w:r>
-        <w:t xml:space="preserve">付録 A. 付録の例</w:t>
+        <w:rPr>
+          <w:rFonts w:hint="eastAsia"/>
+        </w:rPr>
+        <w:t xml:space="preserve">付録</w:t>
+      </w:r>
+      <w:r>
+        <w:t xml:space="preserve"> A. </w:t>
+      </w:r>
+      <w:r>
+        <w:rPr>
+          <w:rFonts w:hint="eastAsia"/>
+        </w:rPr>
+        <w:t xml:space="preserve">付録の例</w:t>
       </w:r>
     </w:p>
     <w:p>
@@ -1708,7 +2570,13 @@
         <w:pStyle w:val="FirstParagraph"/>
       </w:pPr>
       <w:r>
-        <w:t xml:space="preserve">付録は文献の後に置く。節番号は「付録 A」のようになる。</w:t>
+        <w:rPr>
+          <w:rFonts w:hint="eastAsia"/>
+        </w:rPr>
+        <w:t xml:space="preserve">付録は文献の後に置く。節番号は「付録</w:t>
+      </w:r>
+      <w:r>
+        <w:t xml:space="preserve"> A」のようになる。</w:t>
       </w:r>
     </w:p>
     <w:sectPr>
@@ -1743,7 +2611,7 @@
       </w:r>
     </w:p>
   </w:footnote>
-  <w:footnote w:id="20">
+  <w:footnote w:id="18">
     <w:p>
       <w:pPr>
         <w:pStyle w:val="FootnoteText"/>
@@ -1758,6 +2626,9 @@
         <w:t xml:space="preserve"> </w:t>
       </w:r>
       <w:r>
+        <w:rPr>
+          <w:rFonts w:hint="eastAsia"/>
+        </w:rPr>
         <w:t xml:space="preserve">止むを得ず使用する場合は、このように脚注で書く。刷り上がりではすべて脚注となる。</w:t>
       </w:r>
     </w:p>
@@ -1811,14 +2682,14 @@
 <file path=word/numbering.xml><?xml version="1.0" encoding="utf-8"?>
 <w:numbering xmlns:w="http://schemas.openxmlformats.org/wordprocessingml/2006/main">
   <w:abstractNum w:abstractNumId="990">
-    <w:nsid w:val="A990"/>
+    <w:nsid w:val="0000A990"/>
     <w:multiLevelType w:val="multilevel"/>
     <w:lvl w:ilvl="0">
       <w:numFmt w:val="bullet"/>
       <w:lvlText w:val=" "/>
       <w:lvlJc w:val="left"/>
       <w:pPr>
-        <w:ind w:left="720" w:hanging="480"/>
+        <w:ind w:left="720" w:hanging="360"/>
       </w:pPr>
     </w:lvl>
     <w:lvl w:ilvl="1">
@@ -1826,7 +2697,7 @@
       <w:lvlText w:val=" "/>
       <w:lvlJc w:val="left"/>
       <w:pPr>
-        <w:ind w:left="1440" w:hanging="480"/>
+        <w:ind w:left="1440" w:hanging="360"/>
       </w:pPr>
     </w:lvl>
     <w:lvl w:ilvl="2">
@@ -1834,7 +2705,7 @@
       <w:lvlText w:val=" "/>
       <w:lvlJc w:val="left"/>
       <w:pPr>
-        <w:ind w:left="2160" w:hanging="480"/>
+        <w:ind w:left="2160" w:hanging="360"/>
       </w:pPr>
     </w:lvl>
     <w:lvl w:ilvl="3">
@@ -1842,7 +2713,7 @@
       <w:lvlText w:val=" "/>
       <w:lvlJc w:val="left"/>
       <w:pPr>
-        <w:ind w:left="2880" w:hanging="480"/>
+        <w:ind w:left="2880" w:hanging="360"/>
       </w:pPr>
     </w:lvl>
     <w:lvl w:ilvl="4">
@@ -1850,7 +2721,7 @@
       <w:lvlText w:val=" "/>
       <w:lvlJc w:val="left"/>
       <w:pPr>
-        <w:ind w:left="3600" w:hanging="480"/>
+        <w:ind w:left="3600" w:hanging="360"/>
       </w:pPr>
     </w:lvl>
     <w:lvl w:ilvl="5">
@@ -1858,7 +2729,7 @@
       <w:lvlText w:val=" "/>
       <w:lvlJc w:val="left"/>
       <w:pPr>
-        <w:ind w:left="4320" w:hanging="480"/>
+        <w:ind w:left="4320" w:hanging="360"/>
       </w:pPr>
     </w:lvl>
     <w:lvl w:ilvl="6">
@@ -1866,7 +2737,7 @@
       <w:lvlText w:val=" "/>
       <w:lvlJc w:val="left"/>
       <w:pPr>
-        <w:ind w:left="5040" w:hanging="480"/>
+        <w:ind w:left="5040" w:hanging="360"/>
       </w:pPr>
     </w:lvl>
     <w:lvl w:ilvl="7">
@@ -1874,7 +2745,7 @@
       <w:lvlText w:val=" "/>
       <w:lvlJc w:val="left"/>
       <w:pPr>
-        <w:ind w:left="5760" w:hanging="480"/>
+        <w:ind w:left="5760" w:hanging="360"/>
       </w:pPr>
     </w:lvl>
     <w:lvl w:ilvl="8">
@@ -1882,7 +2753,7 @@
       <w:lvlText w:val=" "/>
       <w:lvlJc w:val="left"/>
       <w:pPr>
-        <w:ind w:left="6480" w:hanging="480"/>
+        <w:ind w:left="6480" w:hanging="360"/>
       </w:pPr>
     </w:lvl>
   </w:abstractNum>
@@ -2724,8 +3595,8 @@
     <w:name w:val="KeywordTok"/>
     <w:basedOn w:val="VerbatimChar"/>
     <w:rPr>
+      <w:b/>
       <w:color w:val="007020"/>
-      <w:b/>
     </w:rPr>
   </w:style>
   <w:style w:type="character" w:customStyle="1" w:styleId="DataTypeTok">
@@ -2802,42 +3673,42 @@
     <w:name w:val="ImportTok"/>
     <w:basedOn w:val="VerbatimChar"/>
     <w:rPr>
+      <w:b/>
       <w:color w:val="008000"/>
-      <w:b/>
     </w:rPr>
   </w:style>
   <w:style w:type="character" w:customStyle="1" w:styleId="CommentTok">
     <w:name w:val="CommentTok"/>
     <w:basedOn w:val="VerbatimChar"/>
     <w:rPr>
+      <w:i/>
       <w:color w:val="60a0b0"/>
-      <w:i/>
     </w:rPr>
   </w:style>
   <w:style w:type="character" w:customStyle="1" w:styleId="DocumentationTok">
     <w:name w:val="DocumentationTok"/>
     <w:basedOn w:val="VerbatimChar"/>
     <w:rPr>
+      <w:i/>
       <w:color w:val="ba2121"/>
-      <w:i/>
     </w:rPr>
   </w:style>
   <w:style w:type="character" w:customStyle="1" w:styleId="AnnotationTok">
     <w:name w:val="AnnotationTok"/>
     <w:basedOn w:val="VerbatimChar"/>
     <w:rPr>
-      <w:color w:val="60a0b0"/>
       <w:b/>
       <w:i/>
+      <w:color w:val="60a0b0"/>
     </w:rPr>
   </w:style>
   <w:style w:type="character" w:customStyle="1" w:styleId="CommentVarTok">
     <w:name w:val="CommentVarTok"/>
     <w:basedOn w:val="VerbatimChar"/>
     <w:rPr>
-      <w:color w:val="60a0b0"/>
       <w:b/>
       <w:i/>
+      <w:color w:val="60a0b0"/>
     </w:rPr>
   </w:style>
   <w:style w:type="character" w:customStyle="1" w:styleId="OtherTok">
@@ -2865,8 +3736,8 @@
     <w:name w:val="ControlFlowTok"/>
     <w:basedOn w:val="VerbatimChar"/>
     <w:rPr>
+      <w:b/>
       <w:color w:val="007020"/>
-      <w:b/>
     </w:rPr>
   </w:style>
   <w:style w:type="character" w:customStyle="1" w:styleId="OperatorTok">
@@ -2911,34 +3782,34 @@
     <w:name w:val="InformationTok"/>
     <w:basedOn w:val="VerbatimChar"/>
     <w:rPr>
-      <w:color w:val="60a0b0"/>
       <w:b/>
       <w:i/>
+      <w:color w:val="60a0b0"/>
     </w:rPr>
   </w:style>
   <w:style w:type="character" w:customStyle="1" w:styleId="WarningTok">
     <w:name w:val="WarningTok"/>
     <w:basedOn w:val="VerbatimChar"/>
     <w:rPr>
-      <w:color w:val="60a0b0"/>
       <w:b/>
       <w:i/>
+      <w:color w:val="60a0b0"/>
     </w:rPr>
   </w:style>
   <w:style w:type="character" w:customStyle="1" w:styleId="AlertTok">
     <w:name w:val="AlertTok"/>
     <w:basedOn w:val="VerbatimChar"/>
     <w:rPr>
+      <w:b/>
       <w:color w:val="ff0000"/>
-      <w:b/>
     </w:rPr>
   </w:style>
   <w:style w:type="character" w:customStyle="1" w:styleId="ErrorTok">
     <w:name w:val="ErrorTok"/>
     <w:basedOn w:val="VerbatimChar"/>
     <w:rPr>
+      <w:b/>
       <w:color w:val="ff0000"/>
-      <w:b/>
     </w:rPr>
   </w:style>
   <w:style w:type="character" w:customStyle="1" w:styleId="NormalTok">

</xml_diff>

<commit_message>
Generate the Word sample from a Word-specific source
sample.docx was generated from sample.md and explained Markdown syntax.
It is now generated from docx/sample.md, which explains how to write
in Word (styles, manual numbering, citations). Also regenerate
sample.tex for the header-includes template change.

Co-Authored-By: Claude Opus 5.5 <noreply@anthropic.com>
</commit_message>
<xml_diff>
--- a/docx/sample.docx
+++ b/docx/sample.docx
@@ -21,7 +21,16 @@
         <w:rPr>
           <w:rFonts w:hint="eastAsia"/>
         </w:rPr>
-        <w:t xml:space="preserve">紀要「文化情報学」テンプレートの設計</w:t>
+        <w:t xml:space="preserve">紀要「文化情報学」Word</w:t>
+      </w:r>
+      <w:r>
+        <w:t xml:space="preserve"> </w:t>
+      </w:r>
+      <w:r>
+        <w:rPr>
+          <w:rFonts w:hint="eastAsia"/>
+        </w:rPr>
+        <w:t xml:space="preserve">テンプレートの使い方</w:t>
       </w:r>
     </w:p>
     <w:p>
@@ -32,7 +41,7 @@
         <w:rPr>
           <w:rFonts w:hint="eastAsia"/>
         </w:rPr>
-        <w:t xml:space="preserve">―執筆要項に基づくクラスファイルと文献スタイル―</w:t>
+        <w:t xml:space="preserve">―執筆要項に基づく書式見本―</w:t>
       </w:r>
     </w:p>
     <w:p>
@@ -99,7 +108,19 @@
         <w:rPr>
           <w:rFonts w:hint="eastAsia"/>
         </w:rPr>
-        <w:t xml:space="preserve">日改訂）に基づいて作成したテンプレートの使い方を示すものである。本文そのものが使用例となっており、タイトルページの構成、節番号、図表、数式、脚注、参照文献の書き方を順に説明する。要旨は和文・英文いずれで書いてもよい。</w:t>
+        <w:t xml:space="preserve">日改訂）に基づいて作成した</w:t>
+      </w:r>
+      <w:r>
+        <w:t xml:space="preserve"> </w:t>
+      </w:r>
+      <w:r>
+        <w:t xml:space="preserve">Word </w:t>
+      </w:r>
+      <w:r>
+        <w:rPr>
+          <w:rFonts w:hint="eastAsia"/>
+        </w:rPr>
+        <w:t xml:space="preserve">テンプレートの使い方を示すものである。本文そのものが使用例となっており、タイトル部、見出し、図表、数式、注、参照文献の書き方を順に説明する。この見本の文章を自分の文章に書き換えていけば、執筆要項の体裁に沿った原稿になる。</w:t>
       </w:r>
     </w:p>
     <w:p>
@@ -137,28 +158,7 @@
         <w:rPr>
           <w:rFonts w:hint="eastAsia"/>
         </w:rPr>
-        <w:t xml:space="preserve">で作成し、編集委員会が用意したスタイルファイルを用いることとされている。本テンプレートはその叩き台であり、1</w:t>
-      </w:r>
-      <w:r>
-        <w:t xml:space="preserve"> つの Markdown </w:t>
-      </w:r>
-      <w:r>
-        <w:rPr>
-          <w:rFonts w:hint="eastAsia"/>
-        </w:rPr>
-        <w:t xml:space="preserve">ファイル（sample.md）から</w:t>
-      </w:r>
-      <w:r>
-        <w:t xml:space="preserve"> </w:t>
-      </w:r>
-      <w:r>
-        <w:t xml:space="preserve">LaTeX </w:t>
-      </w:r>
-      <w:r>
-        <w:rPr>
-          <w:rFonts w:hint="eastAsia"/>
-        </w:rPr>
-        <w:t xml:space="preserve">版（sample.tex）と</w:t>
+        <w:t xml:space="preserve">で作成し、編集委員会が用意したスタイルファイルを用いることとされている。本テンプレートはその</w:t>
       </w:r>
       <w:r>
         <w:t xml:space="preserve"> Word </w:t>
@@ -167,25 +167,27 @@
         <w:rPr>
           <w:rFonts w:hint="eastAsia"/>
         </w:rPr>
-        <w:t xml:space="preserve">版（sample.docx）の両方を生成する。先頭のメタデータの</w:t>
-      </w:r>
-      <w:r>
-        <w:t xml:space="preserve"> </w:t>
-      </w:r>
-      <w:r>
-        <w:rPr>
-          <w:rStyle w:val="VerbatimChar"/>
-        </w:rPr>
-        <w:t xml:space="preserve">type</w:t>
-      </w:r>
-      <w:r>
-        <w:t xml:space="preserve"> </w:t>
-      </w:r>
-      <w:r>
-        <w:rPr>
-          <w:rFonts w:hint="eastAsia"/>
-        </w:rPr>
-        <w:t xml:space="preserve">で種別（研究論文・研究ノート・資料紹介・書評）を切り替えると、第</w:t>
+        <w:t xml:space="preserve">版の叩き台であり、用紙・余白・2</w:t>
+      </w:r>
+      <w:r>
+        <w:t xml:space="preserve"> </w:t>
+      </w:r>
+      <w:r>
+        <w:rPr>
+          <w:rFonts w:hint="eastAsia"/>
+        </w:rPr>
+        <w:t xml:space="preserve">段組・文字の大きさ・見出しの書式などはすでに設定してある。これらの設定は変更せず、見本の文章を書き換えて原稿を作成する。</w:t>
+      </w:r>
+    </w:p>
+    <w:p>
+      <w:pPr>
+        <w:pStyle w:val="BodyText"/>
+      </w:pPr>
+      <w:r>
+        <w:rPr>
+          <w:rFonts w:hint="eastAsia"/>
+        </w:rPr>
+        <w:t xml:space="preserve">第</w:t>
       </w:r>
       <w:r>
         <w:t xml:space="preserve"> 1 </w:t>
@@ -194,7 +196,49 @@
         <w:rPr>
           <w:rFonts w:hint="eastAsia"/>
         </w:rPr>
-        <w:t xml:space="preserve">ページ左上の種別ラベルが変わる。</w:t>
+        <w:t xml:space="preserve">ページの上部には、要項</w:t>
+      </w:r>
+      <w:r>
+        <w:t xml:space="preserve"> 4. </w:t>
+      </w:r>
+      <w:r>
+        <w:rPr>
+          <w:rFonts w:hint="eastAsia"/>
+        </w:rPr>
+        <w:t xml:space="preserve">のとおり、種別・表題・著者名・要旨が置かれる。種別は「研究論文」「研究ノート」「資料紹介」「書評」のいずれかを書く。副題は前後の「―」を残して書き換え、副題がなければ行ごと消す。文字を書き換えるときは、見本の文字を選択して上書きすると書式が保たれる。ページ番号は事務局が付けるため、投稿原稿には付けない。</w:t>
+      </w:r>
+    </w:p>
+    <w:p>
+      <w:pPr>
+        <w:pStyle w:val="Heading1"/>
+      </w:pPr>
+      <w:r>
+        <w:t xml:space="preserve">2. </w:t>
+      </w:r>
+      <w:r>
+        <w:rPr>
+          <w:rFonts w:hint="eastAsia"/>
+        </w:rPr>
+        <w:t xml:space="preserve">本文の書き方</w:t>
+      </w:r>
+    </w:p>
+    <w:p>
+      <w:pPr>
+        <w:pStyle w:val="Heading2"/>
+      </w:pPr>
+      <w:r>
+        <w:t xml:space="preserve">2.1 スタイル</w:t>
+      </w:r>
+    </w:p>
+    <w:p>
+      <w:pPr>
+        <w:pStyle w:val="FirstParagraph"/>
+      </w:pPr>
+      <w:r>
+        <w:rPr>
+          <w:rFonts w:hint="eastAsia"/>
+        </w:rPr>
+        <w:t xml:space="preserve">見出し・本文・キャプションなどの書式は、スタイルとして登録してある。段落にカーソルを置くと、ホームタブのスタイルの欄でその段落のスタイルが分かる。書式を直接設定するのではなく、段落ごとに適切なスタイルを選ぶ。もっとも簡単なのは、見本の中の同じ種類の段落をコピーし、文字だけを書き換える方法である。</w:t>
       </w:r>
     </w:p>
     <w:p>
@@ -205,7 +249,7 @@
         <w:rPr>
           <w:rFonts w:hint="eastAsia"/>
         </w:rPr>
-        <w:t xml:space="preserve">第</w:t>
+        <w:t xml:space="preserve">段落の先頭の</w:t>
       </w:r>
       <w:r>
         <w:t xml:space="preserve"> 1 </w:t>
@@ -214,30 +258,7 @@
         <w:rPr>
           <w:rFonts w:hint="eastAsia"/>
         </w:rPr>
-        <w:t xml:space="preserve">ページには、要項</w:t>
-      </w:r>
-      <w:r>
-        <w:t xml:space="preserve"> 4. </w:t>
-      </w:r>
-      <w:r>
-        <w:rPr>
-          <w:rFonts w:hint="eastAsia"/>
-        </w:rPr>
-        <w:t xml:space="preserve">のとおり、タイトル・種別・著者名・アブストラクトが置かれる。ページ番号は事務局が付けるため、投稿原稿には付けない。</w:t>
-      </w:r>
-    </w:p>
-    <w:p>
-      <w:pPr>
-        <w:pStyle w:val="Heading1"/>
-      </w:pPr>
-      <w:r>
-        <w:t xml:space="preserve">2. </w:t>
-      </w:r>
-      <w:r>
-        <w:rPr>
-          <w:rFonts w:hint="eastAsia"/>
-        </w:rPr>
-        <w:t xml:space="preserve">本文の書き方</w:t>
+        <w:t xml:space="preserve">字下げはスタイルで自動的に付くので、全角スペースを入れる必要はない。</w:t>
       </w:r>
     </w:p>
     <w:p>
@@ -245,7 +266,7 @@
         <w:pStyle w:val="Heading2"/>
       </w:pPr>
       <w:r>
-        <w:t xml:space="preserve">2.1 </w:t>
+        <w:t xml:space="preserve">2.2 </w:t>
       </w:r>
       <w:r>
         <w:rPr>
@@ -280,49 +301,43 @@
         <w:rPr>
           <w:rFonts w:hint="eastAsia"/>
         </w:rPr>
-        <w:t xml:space="preserve">5.）。</w:t>
-      </w:r>
-      <w:r>
-        <w:t xml:space="preserve"> </w:t>
-      </w:r>
-      <w:r>
-        <w:t xml:space="preserve">Markdown では</w:t>
-      </w:r>
-      <w:r>
-        <w:t xml:space="preserve"> </w:t>
-      </w:r>
-      <w:r>
-        <w:rPr>
-          <w:rStyle w:val="VerbatimChar"/>
-        </w:rPr>
-        <w:t xml:space="preserve">#</w:t>
-      </w:r>
-      <w:r>
-        <w:t xml:space="preserve">、</w:t>
-      </w:r>
-      <w:r>
-        <w:rPr>
-          <w:rStyle w:val="VerbatimChar"/>
-        </w:rPr>
-        <w:t xml:space="preserve">##</w:t>
-      </w:r>
-      <w:r>
-        <w:t xml:space="preserve">、</w:t>
-      </w:r>
-      <w:r>
-        <w:rPr>
-          <w:rStyle w:val="VerbatimChar"/>
-        </w:rPr>
-        <w:t xml:space="preserve">###</w:t>
-      </w:r>
-      <w:r>
-        <w:t xml:space="preserve"> </w:t>
-      </w:r>
-      <w:r>
-        <w:rPr>
-          <w:rFonts w:hint="eastAsia"/>
-        </w:rPr>
-        <w:t xml:space="preserve">の見出しがそれぞれに対応し、番号は自動で付く。</w:t>
+        <w:t xml:space="preserve">5.）。節・項・目の見出しには、それぞれスタイル「見出し</w:t>
+      </w:r>
+      <w:r>
+        <w:t xml:space="preserve"> </w:t>
+      </w:r>
+      <w:r>
+        <w:rPr>
+          <w:rFonts w:hint="eastAsia"/>
+        </w:rPr>
+        <w:t xml:space="preserve">1」「見出し</w:t>
+      </w:r>
+      <w:r>
+        <w:t xml:space="preserve"> </w:t>
+      </w:r>
+      <w:r>
+        <w:rPr>
+          <w:rFonts w:hint="eastAsia"/>
+        </w:rPr>
+        <w:t xml:space="preserve">2」「見出し</w:t>
+      </w:r>
+      <w:r>
+        <w:t xml:space="preserve"> </w:t>
+      </w:r>
+      <w:r>
+        <w:rPr>
+          <w:rFonts w:hint="eastAsia"/>
+        </w:rPr>
+        <w:t xml:space="preserve">3」を使う。番号は自動では付かないため、「1.</w:t>
+      </w:r>
+      <w:r>
+        <w:t xml:space="preserve"> はじめに」「2.1 </w:t>
+      </w:r>
+      <w:r>
+        <w:rPr>
+          <w:rFonts w:hint="eastAsia"/>
+        </w:rPr>
+        <w:t xml:space="preserve">節と項」のように自分で書く。節を追加・削除したときは、それより後の番号を付け直す。</w:t>
       </w:r>
     </w:p>
     <w:p>
@@ -330,7 +345,7 @@
         <w:pStyle w:val="Heading3"/>
       </w:pPr>
       <w:r>
-        <w:t xml:space="preserve">2.1.1 </w:t>
+        <w:t xml:space="preserve">2.2.1 </w:t>
       </w:r>
       <w:r>
         <w:rPr>
@@ -364,7 +379,7 @@
         <w:pStyle w:val="Heading2"/>
       </w:pPr>
       <w:r>
-        <w:t xml:space="preserve">2.2 </w:t>
+        <w:t xml:space="preserve">2.3 </w:t>
       </w:r>
       <w:r>
         <w:rPr>
@@ -381,7 +396,7 @@
         <w:rPr>
           <w:rFonts w:hint="eastAsia"/>
         </w:rPr>
-        <w:t xml:space="preserve">数式は別行に記し、末尾に通し番号を付ける。</w:t>
+        <w:t xml:space="preserve">数式は別行に記し、末尾に通し番号を付ける。数式の行はスタイル「Equation」とし、Tab、数式、Tab、番号の順に書く。</w:t>
       </w:r>
     </w:p>
     <w:p>
@@ -536,7 +551,7 @@
         <w:rPr>
           <w:rFonts w:hint="eastAsia"/>
         </w:rPr>
-        <w:t xml:space="preserve">本文中に埋め込む場合には、</w:t>
+        <w:t xml:space="preserve">数式は挿入タブの「数式」で入力する。本文中に埋め込む場合には、</w:t>
       </w:r>
       <m:oMath>
         <m:r>
@@ -617,7 +632,16 @@
         <w:rPr>
           <w:rFonts w:hint="eastAsia"/>
         </w:rPr>
-        <w:t xml:space="preserve">のような記法を用いる。式番号は式</w:t>
+        <w:t xml:space="preserve">のような記法を用いる。数式の後に続く文は、スタイル「Body</w:t>
+      </w:r>
+      <w:r>
+        <w:t xml:space="preserve"> Text </w:t>
+      </w:r>
+      <w:r>
+        <w:rPr>
+          <w:rFonts w:hint="eastAsia"/>
+        </w:rPr>
+        <w:t xml:space="preserve">Continued」にすると字下げされない。式番号は自分で付け、本文中では式</w:t>
       </w:r>
       <w:r>
         <w:t xml:space="preserve"> (2) </w:t>
@@ -734,7 +758,7 @@
         <w:pStyle w:val="Heading2"/>
       </w:pPr>
       <w:r>
-        <w:t xml:space="preserve">2.3 </w:t>
+        <w:t xml:space="preserve">2.4 </w:t>
       </w:r>
       <w:r>
         <w:rPr>
@@ -830,16 +854,25 @@
         <w:rPr>
           <w:rFonts w:hint="eastAsia"/>
         </w:rPr>
-        <w:t xml:space="preserve">に例を示す。査読用原稿では図表を本文中に埋め込んで提出し、採択後の最終原稿では図の相当部分を空白にして充分な解像度のデータを別途提出する（要項</w:t>
-      </w:r>
-      <w:r>
-        <w:t xml:space="preserve"> </w:t>
-      </w:r>
-      <w:r>
-        <w:rPr>
-          <w:rFonts w:hint="eastAsia"/>
-        </w:rPr>
-        <w:t xml:space="preserve">4.）。他の文献から転載する場合は、著作権者の了解を得たうえで出典を明記する。</w:t>
+        <w:t xml:space="preserve">に例を示す。図のキャプションは図の下に、表のキャプションは表の上に置き、番号の後は全角スペースで区切る。番号は自分で付け、本文中では「図</w:t>
+      </w:r>
+      <w:r>
+        <w:t xml:space="preserve"> </w:t>
+      </w:r>
+      <w:r>
+        <w:rPr>
+          <w:rFonts w:hint="eastAsia"/>
+        </w:rPr>
+        <w:t xml:space="preserve">1」「表</w:t>
+      </w:r>
+      <w:r>
+        <w:t xml:space="preserve"> </w:t>
+      </w:r>
+      <w:r>
+        <w:rPr>
+          <w:rFonts w:hint="eastAsia"/>
+        </w:rPr>
+        <w:t xml:space="preserve">1」のように参照する。</w:t>
       </w:r>
     </w:p>
     <w:p>
@@ -907,6 +940,44 @@
           <w:rFonts w:hint="eastAsia"/>
         </w:rPr>
         <w:t xml:space="preserve">図の例</w:t>
+      </w:r>
+    </w:p>
+    <w:p>
+      <w:pPr>
+        <w:pStyle w:val="BodyText"/>
+      </w:pPr>
+      <w:r>
+        <w:rPr>
+          <w:rFonts w:hint="eastAsia"/>
+        </w:rPr>
+        <w:t xml:space="preserve">図はスタイル「Captioned</w:t>
+      </w:r>
+      <w:r>
+        <w:t xml:space="preserve"> </w:t>
+      </w:r>
+      <w:r>
+        <w:rPr>
+          <w:rFonts w:hint="eastAsia"/>
+        </w:rPr>
+        <w:t xml:space="preserve">Figure」の段落に挿入タブの「画像」で入れ、段の幅に収まる大きさにする。キャプションはスタイル「Image</w:t>
+      </w:r>
+      <w:r>
+        <w:t xml:space="preserve"> </w:t>
+      </w:r>
+      <w:r>
+        <w:rPr>
+          <w:rFonts w:hint="eastAsia"/>
+        </w:rPr>
+        <w:t xml:space="preserve">Caption」、表のキャプションは「Table</w:t>
+      </w:r>
+      <w:r>
+        <w:t xml:space="preserve"> </w:t>
+      </w:r>
+      <w:r>
+        <w:rPr>
+          <w:rFonts w:hint="eastAsia"/>
+        </w:rPr>
+        <w:t xml:space="preserve">Caption」とする。表は見本の表をコピーして中身を書き換えると、罫線などの体裁がそろう。</w:t>
       </w:r>
     </w:p>
     <w:p>
@@ -1117,6 +1188,49 @@
     </w:tbl>
     <w:p>
       <w:pPr>
+        <w:pStyle w:val="BodyText"/>
+      </w:pPr>
+      <w:r>
+        <w:t xml:space="preserve">2 </w:t>
+      </w:r>
+      <w:r>
+        <w:rPr>
+          <w:rFonts w:hint="eastAsia"/>
+        </w:rPr>
+        <w:t xml:space="preserve">段にまたがる大きな図表は、その前後にセクション区切り（現在の位置から開始）を入れ、その部分だけを</w:t>
+      </w:r>
+      <w:r>
+        <w:t xml:space="preserve"> 1 </w:t>
+      </w:r>
+      <w:r>
+        <w:rPr>
+          <w:rFonts w:hint="eastAsia"/>
+        </w:rPr>
+        <w:t xml:space="preserve">段組にする。</w:t>
+      </w:r>
+    </w:p>
+    <w:p>
+      <w:pPr>
+        <w:pStyle w:val="BodyText"/>
+      </w:pPr>
+      <w:r>
+        <w:rPr>
+          <w:rFonts w:hint="eastAsia"/>
+        </w:rPr>
+        <w:t xml:space="preserve">査読用原稿では図表を本文中に埋め込んで提出し、採択後の最終原稿では図の相当部分を空白にして充分な解像度のデータを別途提出する（要項</w:t>
+      </w:r>
+      <w:r>
+        <w:t xml:space="preserve"> </w:t>
+      </w:r>
+      <w:r>
+        <w:rPr>
+          <w:rFonts w:hint="eastAsia"/>
+        </w:rPr>
+        <w:t xml:space="preserve">4.）。他の文献から転載する場合は、著作権者の了解を得たうえで出典を明記する。</w:t>
+      </w:r>
+    </w:p>
+    <w:p>
+      <w:pPr>
         <w:pStyle w:val="Heading1"/>
       </w:pPr>
       <w:r>
@@ -1131,6 +1245,20 @@
     </w:p>
     <w:p>
       <w:pPr>
+        <w:pStyle w:val="Heading2"/>
+      </w:pPr>
+      <w:r>
+        <w:t xml:space="preserve">4.1 </w:t>
+      </w:r>
+      <w:r>
+        <w:rPr>
+          <w:rFonts w:hint="eastAsia"/>
+        </w:rPr>
+        <w:t xml:space="preserve">本文中での引用</w:t>
+      </w:r>
+    </w:p>
+    <w:p>
+      <w:pPr>
         <w:pStyle w:val="FirstParagraph"/>
       </w:pPr>
       <w:r>
@@ -1146,7 +1274,16 @@
         <w:rPr>
           <w:rFonts w:hint="eastAsia"/>
         </w:rPr>
-        <w:t xml:space="preserve">7.）。表</w:t>
+        <w:t xml:space="preserve">7.）。括弧は全角の（</w:t>
+      </w:r>
+      <w:r>
+        <w:t xml:space="preserve"> </w:t>
+      </w:r>
+      <w:r>
+        <w:rPr>
+          <w:rFonts w:hint="eastAsia"/>
+        </w:rPr>
+        <w:t xml:space="preserve">）を用いる。表</w:t>
       </w:r>
       <w:r>
         <w:t xml:space="preserve"> 2 </w:t>
@@ -1155,16 +1292,7 @@
         <w:rPr>
           <w:rFonts w:hint="eastAsia"/>
         </w:rPr>
-        <w:t xml:space="preserve">に要項の例と対応する</w:t>
-      </w:r>
-      <w:r>
-        <w:t xml:space="preserve"> Markdown </w:t>
-      </w:r>
-      <w:r>
-        <w:rPr>
-          <w:rFonts w:hint="eastAsia"/>
-        </w:rPr>
-        <w:t xml:space="preserve">の書き方を示す。</w:t>
+        <w:t xml:space="preserve">に要項の例を示す。</w:t>
       </w:r>
     </w:p>
     <w:p>
@@ -1184,7 +1312,7 @@
         <w:rPr>
           <w:rFonts w:hint="eastAsia"/>
         </w:rPr>
-        <w:t xml:space="preserve">引用の書き方と出力</w:t>
+        <w:t xml:space="preserve">本文中での引用の例</w:t>
       </w:r>
     </w:p>
     <w:tbl>
@@ -1193,11 +1321,11 @@
         <w:tblW w:type="pct" w:w="5000"/>
         <w:tblLayout w:type="fixed"/>
         <w:tblLook w:firstRow="1" w:lastRow="0" w:firstColumn="0" w:lastColumn="0" w:noHBand="0" w:noVBand="0" w:val="0020"/>
-        <w:tblCaption w:val="表 2　引用の書き方と出力"/>
+        <w:tblCaption w:val="表 2　本文中での引用の例"/>
       </w:tblPr>
       <w:tblGrid>
-        <w:gridCol w:w="4112"/>
-        <w:gridCol w:w="3807"/>
+        <w:gridCol w:w="2772"/>
+        <w:gridCol w:w="5148"/>
       </w:tblGrid>
       <w:tr>
         <w:trPr>
@@ -1211,7 +1339,10 @@
               <w:jc w:val="left"/>
             </w:pPr>
             <w:r>
-              <w:t xml:space="preserve">Markdown</w:t>
+              <w:rPr>
+                <w:rFonts w:hint="eastAsia"/>
+              </w:rPr>
+              <w:t xml:space="preserve">場面</w:t>
             </w:r>
           </w:p>
         </w:tc>
@@ -1226,7 +1357,7 @@
               <w:rPr>
                 <w:rFonts w:hint="eastAsia"/>
               </w:rPr>
-              <w:t xml:space="preserve">出力</w:t>
+              <w:t xml:space="preserve">書き方</w:t>
             </w:r>
           </w:p>
         </w:tc>
@@ -1241,9 +1372,9 @@
             </w:pPr>
             <w:r>
               <w:rPr>
-                <w:rStyle w:val="VerbatimChar"/>
+                <w:rFonts w:hint="eastAsia"/>
               </w:rPr>
-              <w:t xml:space="preserve">@gibson1979</w:t>
+              <w:t xml:space="preserve">文の一部にする</w:t>
             </w:r>
           </w:p>
         </w:tc>
@@ -1276,9 +1407,9 @@
             </w:pPr>
             <w:r>
               <w:rPr>
-                <w:rStyle w:val="VerbatimChar"/>
+                <w:rFonts w:hint="eastAsia"/>
               </w:rPr>
-              <w:t xml:space="preserve">[@saeki1990]</w:t>
+              <w:t xml:space="preserve">括弧で添える</w:t>
             </w:r>
           </w:p>
         </w:tc>
@@ -1317,9 +1448,9 @@
             </w:pPr>
             <w:r>
               <w:rPr>
-                <w:rStyle w:val="VerbatimChar"/>
+                <w:rFonts w:hint="eastAsia"/>
               </w:rPr>
-              <w:t xml:space="preserve">@haugeland1987 [p.123]</w:t>
+              <w:t xml:space="preserve">ページを示す</w:t>
             </w:r>
           </w:p>
         </w:tc>
@@ -1361,9 +1492,9 @@
             </w:pPr>
             <w:r>
               <w:rPr>
-                <w:rStyle w:val="VerbatimChar"/>
+                <w:rFonts w:hint="eastAsia"/>
               </w:rPr>
-              <w:t xml:space="preserve">Simon [-@simon1973; -@simon1981]</w:t>
+              <w:t xml:space="preserve">同一著者の複数の文献</w:t>
             </w:r>
           </w:p>
         </w:tc>
@@ -1408,85 +1539,9 @@
             </w:pPr>
             <w:r>
               <w:rPr>
-                <w:rStyle w:val="VerbatimChar"/>
-              </w:rPr>
-              <w:t xml:space="preserve">[@simon1973; @simon1981]</w:t>
-            </w:r>
-          </w:p>
-        </w:tc>
-        <w:tc>
-          <w:tcPr/>
-          <w:p>
-            <w:pPr>
-              <w:pStyle w:val="Compact"/>
-              <w:jc w:val="left"/>
-            </w:pPr>
-            <w:r>
-              <w:rPr>
                 <w:rFonts w:hint="eastAsia"/>
               </w:rPr>
-              <w:t xml:space="preserve">（Simon,</w:t>
-            </w:r>
-            <w:r>
-              <w:t xml:space="preserve"> 1973, </w:t>
-            </w:r>
-            <w:r>
-              <w:rPr>
-                <w:rFonts w:hint="eastAsia"/>
-              </w:rPr>
-              <w:t xml:space="preserve">1981）</w:t>
-            </w:r>
-          </w:p>
-        </w:tc>
-      </w:tr>
-      <w:tr>
-        <w:tc>
-          <w:tcPr/>
-          <w:p>
-            <w:pPr>
-              <w:pStyle w:val="Compact"/>
-              <w:jc w:val="left"/>
-            </w:pPr>
-            <w:r>
-              <w:rPr>
-                <w:rStyle w:val="VerbatimChar"/>
-              </w:rPr>
-              <w:t xml:space="preserve">@cohen1990a</w:t>
-            </w:r>
-          </w:p>
-        </w:tc>
-        <w:tc>
-          <w:tcPr/>
-          <w:p>
-            <w:pPr>
-              <w:pStyle w:val="Compact"/>
-              <w:jc w:val="left"/>
-            </w:pPr>
-            <w:r>
-              <w:t xml:space="preserve">Cohen &amp; Levesque </w:t>
-            </w:r>
-            <w:r>
-              <w:rPr>
-                <w:rFonts w:hint="eastAsia"/>
-              </w:rPr>
-              <w:t xml:space="preserve">（1990a）</w:t>
-            </w:r>
-          </w:p>
-        </w:tc>
-      </w:tr>
-      <w:tr>
-        <w:tc>
-          <w:tcPr/>
-          <w:p>
-            <w:pPr>
-              <w:pStyle w:val="Compact"/>
-              <w:jc w:val="left"/>
-            </w:pPr>
-            <w:r>
-              <w:rPr>
-                <w:rStyle w:val="VerbatimChar"/>
-              </w:rPr>
-              <w:t xml:space="preserve">[@cohen1990a; @cohen1990b]</w:t>
+              <w:t xml:space="preserve">同一著者・同一年の文献</w:t>
             </w:r>
           </w:p>
         </w:tc>
@@ -1525,9 +1580,9 @@
             </w:pPr>
             <w:r>
               <w:rPr>
-                <w:rStyle w:val="VerbatimChar"/>
+                <w:rFonts w:hint="eastAsia"/>
               </w:rPr>
-              <w:t xml:space="preserve">[@anzai1992; @joshi1981; @minsky1975; @minsky1986]</w:t>
+              <w:t xml:space="preserve">複数の文献</w:t>
             </w:r>
           </w:p>
         </w:tc>
@@ -1616,7 +1671,104 @@
         <w:rPr>
           <w:rFonts w:hint="eastAsia"/>
         </w:rPr>
-        <w:t xml:space="preserve">のように書く。</w:t>
+        <w:t xml:space="preserve">のように書く。欧文の著者が</w:t>
+      </w:r>
+      <w:r>
+        <w:t xml:space="preserve"> 2 </w:t>
+      </w:r>
+      <w:r>
+        <w:rPr>
+          <w:rFonts w:hint="eastAsia"/>
+        </w:rPr>
+        <w:t xml:space="preserve">名のときは「&amp;」で結び、3</w:t>
+      </w:r>
+      <w:r>
+        <w:t xml:space="preserve"> </w:t>
+      </w:r>
+      <w:r>
+        <w:rPr>
+          <w:rFonts w:hint="eastAsia"/>
+        </w:rPr>
+        <w:t xml:space="preserve">名以上のときは第</w:t>
+      </w:r>
+      <w:r>
+        <w:t xml:space="preserve"> 1 </w:t>
+      </w:r>
+      <w:r>
+        <w:rPr>
+          <w:rFonts w:hint="eastAsia"/>
+        </w:rPr>
+        <w:t xml:space="preserve">著者の後に「et</w:t>
+      </w:r>
+      <w:r>
+        <w:t xml:space="preserve"> </w:t>
+      </w:r>
+      <w:r>
+        <w:rPr>
+          <w:rFonts w:hint="eastAsia"/>
+        </w:rPr>
+        <w:t xml:space="preserve">al.」を付ける。和文の著者が</w:t>
+      </w:r>
+      <w:r>
+        <w:t xml:space="preserve"> 2 </w:t>
+      </w:r>
+      <w:r>
+        <w:rPr>
+          <w:rFonts w:hint="eastAsia"/>
+        </w:rPr>
+        <w:t xml:space="preserve">名のときは「・」で結び、3</w:t>
+      </w:r>
+      <w:r>
+        <w:t xml:space="preserve"> </w:t>
+      </w:r>
+      <w:r>
+        <w:rPr>
+          <w:rFonts w:hint="eastAsia"/>
+        </w:rPr>
+        <w:t xml:space="preserve">名以上のときは第</w:t>
+      </w:r>
+      <w:r>
+        <w:t xml:space="preserve"> 1 </w:t>
+      </w:r>
+      <w:r>
+        <w:rPr>
+          <w:rFonts w:hint="eastAsia"/>
+        </w:rPr>
+        <w:t xml:space="preserve">著者の後に「他」を付ける。</w:t>
+      </w:r>
+    </w:p>
+    <w:p>
+      <w:pPr>
+        <w:pStyle w:val="Heading2"/>
+      </w:pPr>
+      <w:r>
+        <w:t xml:space="preserve">4.2 </w:t>
+      </w:r>
+      <w:r>
+        <w:rPr>
+          <w:rFonts w:hint="eastAsia"/>
+        </w:rPr>
+        <w:t xml:space="preserve">文献リスト</w:t>
+      </w:r>
+    </w:p>
+    <w:p>
+      <w:pPr>
+        <w:pStyle w:val="FirstParagraph"/>
+      </w:pPr>
+      <w:r>
+        <w:rPr>
+          <w:rFonts w:hint="eastAsia"/>
+        </w:rPr>
+        <w:t xml:space="preserve">本文と謝辞の後に、番号を付けない見出し「文献」を置き、本文中で引用した文献をすべて並べる。文献リストの段落はスタイル「文献目録」とすると、2</w:t>
+      </w:r>
+      <w:r>
+        <w:t xml:space="preserve"> </w:t>
+      </w:r>
+      <w:r>
+        <w:rPr>
+          <w:rFonts w:hint="eastAsia"/>
+        </w:rPr>
+        <w:t xml:space="preserve">行目以降がぶら下がる。見本の文献リストの段落をコピーして書き換えるとよい。</w:t>
       </w:r>
     </w:p>
     <w:p>
@@ -1627,7 +1779,7 @@
         <w:rPr>
           <w:rFonts w:hint="eastAsia"/>
         </w:rPr>
-        <w:t xml:space="preserve">文献リストは「文献」という見出しのもとに出力される。欧文と和文を区別せず、第</w:t>
+        <w:t xml:space="preserve">欧文と和文を区別せず、第</w:t>
       </w:r>
       <w:r>
         <w:t xml:space="preserve"> 1 </w:t>
@@ -1636,46 +1788,7 @@
         <w:rPr>
           <w:rFonts w:hint="eastAsia"/>
         </w:rPr>
-        <w:t xml:space="preserve">著者の姓のアルファベット順に並び、番号は付かない。和文文献には</w:t>
-      </w:r>
-      <w:r>
-        <w:t xml:space="preserve"> bib ファイルで</w:t>
-      </w:r>
-      <w:r>
-        <w:t xml:space="preserve"> </w:t>
-      </w:r>
-      <w:r>
-        <w:rPr>
-          <w:rStyle w:val="VerbatimChar"/>
-        </w:rPr>
-        <w:t xml:space="preserve">langid = {japanese}</w:t>
-      </w:r>
-      <w:r>
-        <w:t xml:space="preserve"> </w:t>
-      </w:r>
-      <w:r>
-        <w:rPr>
-          <w:rFonts w:hint="eastAsia"/>
-        </w:rPr>
-        <w:t xml:space="preserve">を付け、正しい位置に並ぶよう</w:t>
-      </w:r>
-      <w:r>
-        <w:t xml:space="preserve"> </w:t>
-      </w:r>
-      <w:r>
-        <w:rPr>
-          <w:rStyle w:val="VerbatimChar"/>
-        </w:rPr>
-        <w:t xml:space="preserve">sortname</w:t>
-      </w:r>
-      <w:r>
-        <w:t xml:space="preserve"> </w:t>
-      </w:r>
-      <w:r>
-        <w:rPr>
-          <w:rFonts w:hint="eastAsia"/>
-        </w:rPr>
-        <w:t xml:space="preserve">にローマ字読みを書き、キーもローマ字（姓＋年）にする。以下は要項に挙げられた例をすべて引用したものである：</w:t>
+        <w:t xml:space="preserve">著者の姓のアルファベット順に並べ、番号は付けない。和文文献はローマ字読みで並べる。同一著者の文献は発表年の順に並べ、同一著者・同一年の文献は「1990a」「1990b」のように区別する。以下は要項に挙げられた例をすべて引用したものであり、これらの文献リストでの書き方が見本となる：</w:t>
       </w:r>
       <w:r>
         <w:t xml:space="preserve"> </w:t>
@@ -1811,28 +1924,7 @@
         <w:rPr>
           <w:rFonts w:hint="eastAsia"/>
         </w:rPr>
-        <w:t xml:space="preserve">本テンプレートは非公式の叩き台である。判型・字詰め・フォントサイズなどは、</w:t>
-      </w:r>
-      <w:r>
-        <w:t xml:space="preserve"> </w:t>
-      </w:r>
-      <w:r>
-        <w:t xml:space="preserve">LaTeX </w:t>
-      </w:r>
-      <w:r>
-        <w:rPr>
-          <w:rFonts w:hint="eastAsia"/>
-        </w:rPr>
-        <w:t xml:space="preserve">版は刊行された論文の組版に、Word</w:t>
-      </w:r>
-      <w:r>
-        <w:t xml:space="preserve"> </w:t>
-      </w:r>
-      <w:r>
-        <w:rPr>
-          <w:rFonts w:hint="eastAsia"/>
-        </w:rPr>
-        <w:t xml:space="preserve">版は学会事務局の</w:t>
+        <w:t xml:space="preserve">本テンプレートは非公式の叩き台である。判型・字詰め・フォントサイズなどは、学会事務局の</w:t>
       </w:r>
       <w:r>
         <w:t xml:space="preserve"> Word </w:t>
@@ -1863,7 +1955,7 @@
         <w:rPr>
           <w:rFonts w:hint="eastAsia"/>
         </w:rPr>
-        <w:t xml:space="preserve">謝辞は本文の後、文献の前に置く。</w:t>
+        <w:t xml:space="preserve">謝辞は本文の後、文献の前に、番号を付けない見出し「謝辞」のもとに置く。</w:t>
       </w:r>
     </w:p>
     <w:p>
@@ -2573,10 +2665,16 @@
         <w:rPr>
           <w:rFonts w:hint="eastAsia"/>
         </w:rPr>
-        <w:t xml:space="preserve">付録は文献の後に置く。節番号は「付録</w:t>
-      </w:r>
-      <w:r>
-        <w:t xml:space="preserve"> A」のようになる。</w:t>
+        <w:t xml:space="preserve">付録は文献の後に置く。見出しは「付録</w:t>
+      </w:r>
+      <w:r>
+        <w:t xml:space="preserve"> A. </w:t>
+      </w:r>
+      <w:r>
+        <w:rPr>
+          <w:rFonts w:hint="eastAsia"/>
+        </w:rPr>
+        <w:t xml:space="preserve">付録の例」のように書く。</w:t>
       </w:r>
     </w:p>
     <w:sectPr>
@@ -2629,7 +2727,7 @@
         <w:rPr>
           <w:rFonts w:hint="eastAsia"/>
         </w:rPr>
-        <w:t xml:space="preserve">止むを得ず使用する場合は、このように脚注で書く。刷り上がりではすべて脚注となる。</w:t>
+        <w:t xml:space="preserve">止むを得ず使用する場合は、参考資料タブの「脚注の挿入」で、このように脚注として書く。</w:t>
       </w:r>
     </w:p>
   </w:footnote>

</xml_diff>

<commit_message>
Write the references guide and follow the guidelines for Japanese journals
docs/references.md explains in-text citations, the reference list and
each entry type per section 7 of the submission guidelines, with .bib
examples. Japanese journal entries now put a full stop after the
journal name, following the guidelines' only Japanese journal example.

Co-Authored-By: Claude Opus 5.5 <noreply@anthropic.com>
</commit_message>
<xml_diff>
--- a/docx/sample.docx
+++ b/docx/sample.docx
@@ -2006,10 +2006,7 @@
         <w:rPr>
           <w:rFonts w:hint="eastAsia"/>
         </w:rPr>
-        <w:t xml:space="preserve">花子（1992）．認知科学における知識表現の諸問題．『認知科学』,</w:t>
-      </w:r>
-      <w:r>
-        <w:t xml:space="preserve"> </w:t>
+        <w:t xml:space="preserve">花子（1992）．認知科学における知識表現の諸問題．『認知科学』．</w:t>
       </w:r>
       <w:r>
         <w:rPr>

</xml_diff>